<commit_message>
claude upgrade popquiz 1
</commit_message>
<xml_diff>
--- a/copywriting-claude/Plan-article-blog-Popquiz-FR.docx
+++ b/copywriting-claude/Plan-article-blog-Popquiz-FR.docx
@@ -334,7 +334,7 @@
         <w:rPr>
           <w:b/>
         </w:rPr>
-        <w:t xml:space="preserve">Quiz vidéo : la méthode pour capturer 4 fois plus de contacts sur une vidéo (avec exemples concrets)</w:t>
+        <w:t xml:space="preserve">Quiz vidéo : la méthode que tes concurrents découvrent à peine (87 % des marketeurs disent que ça vend)</w:t>
       </w:r>
     </w:p>
     <w:p>
@@ -352,7 +352,82 @@
         <w:pStyle w:val="FirstParagraph"/>
       </w:pPr>
       <w:r>
-        <w:t xml:space="preserve">Un quiz vidéo (ou Popquiz) est un quiz qui apparaît au milieu d’une vidéo, au moment que tu choisis. Le visiteur regarde, ton quiz s’affiche par-dessus, il répond, la vidéo reprend. Cinq raisons pour lesquelles ça performe autant : (1) la vidéo retient l’attention 4 fois plus longtemps qu’une page texte, (2) le quiz transforme un spectateur passif en contact trié et rangé dans Systeme io, (3) tu peux glisser ton quiz par-dessus n’importe quelle vidéo YouTube ou Vimeo (la tienne, celle d’un partenaire, ou une vidéo qui cartonne déjà sur ta thématique), (4) c’est légal tant que tu utilises le lecteur d’origine sans copier la vidéo (comme un marque-page glissé dans un livre prêté), (5) tu colles ton Popquiz partout en un clic : sur ton blog, sur ta page Systeme io, sur ton site WordPress. Avec</w:t>
+        <w:t xml:space="preserve">Un quiz vidéo (ou Popquiz) est un quiz qui apparaît au milieu d’une vidéo, au moment que tu choisis. Le visiteur regarde, ton quiz s’affiche par-dessus, il répond, la vidéo reprend. Cinq chiffres qui prouvent l’intérêt du format : (1)</w:t>
+      </w:r>
+      <w:r>
+        <w:t xml:space="preserve"> </w:t>
+      </w:r>
+      <w:r>
+        <w:rPr>
+          <w:b/>
+        </w:rPr>
+        <w:t xml:space="preserve">87 % des marketeurs disent que la vidéo a directement augmenté leurs ventes</w:t>
+      </w:r>
+      <w:r>
+        <w:t xml:space="preserve"> </w:t>
+      </w:r>
+      <w:r>
+        <w:t xml:space="preserve">(Wyzowl State of Video Marketing 2024), (2)</w:t>
+      </w:r>
+      <w:r>
+        <w:t xml:space="preserve"> </w:t>
+      </w:r>
+      <w:r>
+        <w:rPr>
+          <w:b/>
+        </w:rPr>
+        <w:t xml:space="preserve">un visiteur passe 2 fois plus de temps sur une page qui contient une vidéo</w:t>
+      </w:r>
+      <w:r>
+        <w:t xml:space="preserve"> </w:t>
+      </w:r>
+      <w:r>
+        <w:t xml:space="preserve">(Wistia State of Video Report 2024), (3)</w:t>
+      </w:r>
+      <w:r>
+        <w:t xml:space="preserve"> </w:t>
+      </w:r>
+      <w:r>
+        <w:rPr>
+          <w:b/>
+        </w:rPr>
+        <w:t xml:space="preserve">le contenu interactif génère 2 fois plus de conversions que le contenu passif</w:t>
+      </w:r>
+      <w:r>
+        <w:t xml:space="preserve"> </w:t>
+      </w:r>
+      <w:r>
+        <w:t xml:space="preserve">(Outgrow Interactive Content Statistics), (4)</w:t>
+      </w:r>
+      <w:r>
+        <w:t xml:space="preserve"> </w:t>
+      </w:r>
+      <w:r>
+        <w:rPr>
+          <w:b/>
+        </w:rPr>
+        <w:t xml:space="preserve">le taux moyen de capture d’un quiz lead-magnet est de 33,6 %, contre 2 à 3 % pour un opt-in classique avec ebook</w:t>
+      </w:r>
+      <w:r>
+        <w:t xml:space="preserve"> </w:t>
+      </w:r>
+      <w:r>
+        <w:t xml:space="preserve">(Interact Quiz Marketing Statistics), (5)</w:t>
+      </w:r>
+      <w:r>
+        <w:t xml:space="preserve"> </w:t>
+      </w:r>
+      <w:r>
+        <w:rPr>
+          <w:b/>
+        </w:rPr>
+        <w:t xml:space="preserve">la vidéo interactive multiplie l’engagement par 5 vs la vidéo linéaire</w:t>
+      </w:r>
+      <w:r>
+        <w:t xml:space="preserve"> </w:t>
+      </w:r>
+      <w:r>
+        <w:t xml:space="preserve">(Demand Gen Report). Tu prends ta vidéo (ou une vidéo qui cartonne déjà sur ta thématique sans la voler, comme un marque-page glissé dans un livre prêté), tu y glisses ton quiz, et tu colles le résultat sur ton blog ou ta page Systeme io. Avec</w:t>
       </w:r>
       <w:r>
         <w:t xml:space="preserve"> </w:t>
@@ -388,13 +463,24 @@
         <w:rPr>
           <w:b/>
         </w:rPr>
-        <w:t xml:space="preserve">Paragraphe 1 — Hook</w:t>
-      </w:r>
-      <w:r>
-        <w:t xml:space="preserve"> </w:t>
-      </w:r>
-      <w:r>
-        <w:t xml:space="preserve">Combien de temps reste un visiteur sur ta dernière vidéo YouTube ? En moyenne 32 secondes. Sur une page texte ? 17 secondes. Et combien parmi eux te laissent leur email ? Probablement zéro. La vidéo passive ne capte presque personne.</w:t>
+        <w:t xml:space="preserve">Paragraphe 1 — Hook chiffré</w:t>
+      </w:r>
+      <w:r>
+        <w:t xml:space="preserve"> </w:t>
+      </w:r>
+      <w:r>
+        <w:t xml:space="preserve">55 % des visiteurs passent moins de 15 secondes sur une page de blog (</w:t>
+      </w:r>
+      <w:hyperlink r:id="rId32">
+        <w:r>
+          <w:rPr>
+            <w:rStyle w:val="Hyperlink"/>
+          </w:rPr>
+          <w:t xml:space="preserve">Chartbeat</w:t>
+        </w:r>
+      </w:hyperlink>
+      <w:r>
+        <w:t xml:space="preserve">). Sur ta dernière vidéo YouTube, le visiteur reste en moyenne 32 secondes. Et combien parmi eux te laissent leur email ? Probablement zéro. La vidéo passive ne capte presque personne.</w:t>
       </w:r>
     </w:p>
     <w:p>
@@ -411,7 +497,51 @@
         <w:t xml:space="preserve"> </w:t>
       </w:r>
       <w:r>
-        <w:t xml:space="preserve">Pourtant la vidéo est le format qui retient le plus l’attention en 2026. Le problème, c’est qu’elle est passive. Le visiteur regarde, scrolle, oublie. Sauf si tu lui demandes de cliquer.</w:t>
+        <w:t xml:space="preserve">Pourtant la vidéo est le format qui rapporte le plus en 2026.</w:t>
+      </w:r>
+      <w:r>
+        <w:t xml:space="preserve"> </w:t>
+      </w:r>
+      <w:r>
+        <w:rPr>
+          <w:b/>
+        </w:rPr>
+        <w:t xml:space="preserve">87 % des marketeurs disent que la vidéo a directement augmenté leurs ventes</w:t>
+      </w:r>
+      <w:r>
+        <w:t xml:space="preserve"> </w:t>
+      </w:r>
+      <w:r>
+        <w:t xml:space="preserve">(rapport</w:t>
+      </w:r>
+      <w:r>
+        <w:t xml:space="preserve"> </w:t>
+      </w:r>
+      <w:hyperlink r:id="rId33">
+        <w:r>
+          <w:rPr>
+            <w:rStyle w:val="Hyperlink"/>
+          </w:rPr>
+          <w:t xml:space="preserve">Wyzowl State of Video Marketing 2024</w:t>
+        </w:r>
+      </w:hyperlink>
+      <w:r>
+        <w:t xml:space="preserve">).</w:t>
+      </w:r>
+      <w:r>
+        <w:t xml:space="preserve"> </w:t>
+      </w:r>
+      <w:r>
+        <w:rPr>
+          <w:b/>
+        </w:rPr>
+        <w:t xml:space="preserve">Les entreprises qui utilisent la vidéo voient leurs revenus croître 49 % plus vite</w:t>
+      </w:r>
+      <w:r>
+        <w:t xml:space="preserve"> </w:t>
+      </w:r>
+      <w:r>
+        <w:t xml:space="preserve">que celles qui ne l’utilisent pas (étude Aberdeen Group). Le problème, c’est que la vidéo est passive. Le visiteur regarde, scrolle, oublie. Sauf si tu lui demandes de cliquer.</w:t>
       </w:r>
     </w:p>
     <w:p>
@@ -428,7 +558,7 @@
         <w:t xml:space="preserve"> </w:t>
       </w:r>
       <w:r>
-        <w:t xml:space="preserve">Le quiz vidéo (ou Popquiz) règle ce paradoxe. Tu prends une vidéo qui parle déjà à ton audience, tu y glisses 2 ou 3 quiz aux moments-clés, et tu transformes chaque spectateur en contact rangé selon ses réponses. Voici comment ça marche, pourquoi c’est légal, et 7 cas d’usage qui font que tu vas vouloir t’y mettre cette semaine.</w:t>
+        <w:t xml:space="preserve">Le quiz vidéo (ou Popquiz) règle ce paradoxe. Tu prends une vidéo qui parle déjà à ton audience, tu y glisses 2 ou 3 quiz aux moments-clés, et tu transformes chaque spectateur en contact rangé selon ses réponses. Voici les chiffres qui prouvent que ça marche, pourquoi c’est légal, et 7 cas d’usage qui font que tu vas vouloir t’y mettre cette semaine.</w:t>
       </w:r>
     </w:p>
     <w:p>
@@ -442,11 +572,11 @@
       <w:pPr>
         <w:pStyle w:val="Heading2"/>
       </w:pPr>
-      <w:bookmarkStart w:id="32" w:name="sommaire"/>
+      <w:bookmarkStart w:id="34" w:name="sommaire"/>
       <w:r>
         <w:t xml:space="preserve">Sommaire</w:t>
       </w:r>
-      <w:bookmarkEnd w:id="32"/>
+      <w:bookmarkEnd w:id="34"/>
     </w:p>
     <w:p>
       <w:pPr>
@@ -457,7 +587,7 @@
         <w:pStyle w:val="Compact"/>
       </w:pPr>
       <w:r>
-        <w:t xml:space="preserve">C’est quoi un quiz vidéo (Popquiz) ?</w:t>
+        <w:t xml:space="preserve">Quiz vidéo : la mécanique en 30 secondes</w:t>
       </w:r>
     </w:p>
     <w:p>
@@ -469,7 +599,7 @@
         <w:pStyle w:val="Compact"/>
       </w:pPr>
       <w:r>
-        <w:t xml:space="preserve">Pourquoi le format performe autant : 5 raisons chiffrées</w:t>
+        <w:t xml:space="preserve">5 raisons sous-estimées de t’y mettre cette semaine</w:t>
       </w:r>
     </w:p>
     <w:p>
@@ -481,7 +611,7 @@
         <w:pStyle w:val="Compact"/>
       </w:pPr>
       <w:r>
-        <w:t xml:space="preserve">Glisser un quiz dans une vidéo YouTube, sans rien voler</w:t>
+        <w:t xml:space="preserve">Glisser un quiz sur n’importe quelle vidéo YouTube (sans rien voler à personne)</w:t>
       </w:r>
     </w:p>
     <w:p>
@@ -493,7 +623,7 @@
         <w:pStyle w:val="Compact"/>
       </w:pPr>
       <w:r>
-        <w:t xml:space="preserve">7 cas d’usage concrets pour solopreneurs et formateurs</w:t>
+        <w:t xml:space="preserve">7 façons de transformer une vidéo en machine à contacts</w:t>
       </w:r>
     </w:p>
     <w:p>
@@ -505,7 +635,7 @@
         <w:pStyle w:val="Compact"/>
       </w:pPr>
       <w:r>
-        <w:t xml:space="preserve">Comment créer ton premier Popquiz dans Tiquiz (étape par étape)</w:t>
+        <w:t xml:space="preserve">Ton premier Popquiz en 30 minutes (étape par étape)</w:t>
       </w:r>
     </w:p>
     <w:p>
@@ -517,7 +647,7 @@
         <w:pStyle w:val="Compact"/>
       </w:pPr>
       <w:r>
-        <w:t xml:space="preserve">Les outils du marché : EdPuzzle, H5P, Mindstamp, Tiquiz</w:t>
+        <w:t xml:space="preserve">Pourquoi tu paies 10 fois moins avec Tiquiz qu’avec un outil US</w:t>
       </w:r>
     </w:p>
     <w:p>
@@ -529,7 +659,7 @@
         <w:pStyle w:val="Compact"/>
       </w:pPr>
       <w:r>
-        <w:t xml:space="preserve">FAQ</w:t>
+        <w:t xml:space="preserve">Les 10 questions qui reviennent (et les réponses cash)</w:t>
       </w:r>
     </w:p>
     <w:p>
@@ -541,7 +671,7 @@
         <w:pStyle w:val="Compact"/>
       </w:pPr>
       <w:r>
-        <w:t xml:space="preserve">Prêt à lancer ton premier Popquiz ?</w:t>
+        <w:t xml:space="preserve">À toi de jouer</w:t>
       </w:r>
     </w:p>
     <w:p>
@@ -555,21 +685,21 @@
       <w:pPr>
         <w:pStyle w:val="Heading2"/>
       </w:pPr>
-      <w:bookmarkStart w:id="33" w:name="Xa9b47126d515d5b017883112d99c501f05414d2"/>
-      <w:r>
-        <w:t xml:space="preserve">Section 1 — C’est quoi un quiz vidéo (Popquiz) ?</w:t>
-      </w:r>
-      <w:bookmarkEnd w:id="33"/>
+      <w:bookmarkStart w:id="35" w:name="X10b9cebd32ac69a7ba3862f0edc6189bde9fd9f"/>
+      <w:r>
+        <w:t xml:space="preserve">Section 1 — Quiz vidéo : la mécanique en 30 secondes</w:t>
+      </w:r>
+      <w:bookmarkEnd w:id="35"/>
     </w:p>
     <w:p>
       <w:pPr>
         <w:pStyle w:val="Heading3"/>
       </w:pPr>
-      <w:bookmarkStart w:id="34" w:name="définition"/>
+      <w:bookmarkStart w:id="36" w:name="définition"/>
       <w:r>
         <w:t xml:space="preserve">Définition</w:t>
       </w:r>
-      <w:bookmarkEnd w:id="34"/>
+      <w:bookmarkEnd w:id="36"/>
     </w:p>
     <w:p>
       <w:pPr>
@@ -598,11 +728,11 @@
       <w:pPr>
         <w:pStyle w:val="Heading3"/>
       </w:pPr>
-      <w:bookmarkStart w:id="35" w:name="comment-ça-marche-en-30-secondes"/>
+      <w:bookmarkStart w:id="37" w:name="comment-ça-marche-en-30-secondes"/>
       <w:r>
         <w:t xml:space="preserve">Comment ça marche en 30 secondes</w:t>
       </w:r>
-      <w:bookmarkEnd w:id="35"/>
+      <w:bookmarkEnd w:id="37"/>
     </w:p>
     <w:p>
       <w:pPr>
@@ -668,11 +798,11 @@
       <w:pPr>
         <w:pStyle w:val="Heading3"/>
       </w:pPr>
-      <w:bookmarkStart w:id="36" w:name="pourquoi-ça-change-tout"/>
+      <w:bookmarkStart w:id="38" w:name="pourquoi-ça-change-tout"/>
       <w:r>
         <w:t xml:space="preserve">Pourquoi ça change tout</w:t>
       </w:r>
-      <w:bookmarkEnd w:id="36"/>
+      <w:bookmarkEnd w:id="38"/>
     </w:p>
     <w:p>
       <w:pPr>
@@ -707,74 +837,270 @@
       <w:pPr>
         <w:pStyle w:val="Heading2"/>
       </w:pPr>
-      <w:bookmarkStart w:id="37" w:name="Xca59b110d11e5d6fa8c37828071f5b5643b2fe8"/>
-      <w:r>
-        <w:t xml:space="preserve">Section 2 — Pourquoi le format performe : 5 raisons chiffrées</w:t>
-      </w:r>
-      <w:bookmarkEnd w:id="37"/>
+      <w:bookmarkStart w:id="39" w:name="X30c3d7d928600826551a006f40749e0f699d254"/>
+      <w:r>
+        <w:t xml:space="preserve">Section 2 — 5 raisons sous-estimées de t’y mettre cette semaine</w:t>
+      </w:r>
+      <w:bookmarkEnd w:id="39"/>
     </w:p>
     <w:p>
       <w:pPr>
         <w:pStyle w:val="Heading3"/>
       </w:pPr>
-      <w:bookmarkStart w:id="38" w:name="X96486a144852c08ea37a812d5e5b1b80d09dd4f"/>
-      <w:r>
-        <w:t xml:space="preserve">2.1. La vidéo retient 4 fois plus l’attention qu’une page texte</w:t>
-      </w:r>
-      <w:bookmarkEnd w:id="38"/>
+      <w:bookmarkStart w:id="40" w:name="X5aff0fdafc6ee48e92747b18515422add943d11"/>
+      <w:r>
+        <w:t xml:space="preserve">2.1. La vidéo, c’est ce qui vend le plus en ce moment (et de très loin)</w:t>
+      </w:r>
+      <w:bookmarkEnd w:id="40"/>
     </w:p>
     <w:p>
       <w:pPr>
         <w:pStyle w:val="FirstParagraph"/>
       </w:pPr>
       <w:r>
-        <w:t xml:space="preserve">Les visiteurs passent en moyenne</w:t>
-      </w:r>
-      <w:r>
-        <w:t xml:space="preserve"> </w:t>
-      </w:r>
-      <w:r>
         <w:rPr>
           <w:b/>
         </w:rPr>
-        <w:t xml:space="preserve">2 minutes 30 sur une vidéo</w:t>
-      </w:r>
-      <w:r>
-        <w:t xml:space="preserve"> </w:t>
-      </w:r>
-      <w:r>
-        <w:t xml:space="preserve">contre 30 à 40 secondes sur un article (source :</w:t>
-      </w:r>
-      <w:r>
-        <w:t xml:space="preserve"> </w:t>
-      </w:r>
-      <w:hyperlink r:id="rId39">
+        <w:t xml:space="preserve">87 % des marketeurs disent que la vidéo a directement augmenté leurs ventes.</w:t>
+      </w:r>
+      <w:r>
+        <w:t xml:space="preserve"> </w:t>
+      </w:r>
+      <w:r>
+        <w:rPr>
+          <w:b/>
+        </w:rPr>
+        <w:t xml:space="preserve">90 % disent qu’elle a aidé à générer des leads.</w:t>
+      </w:r>
+      <w:r>
+        <w:t xml:space="preserve"> </w:t>
+      </w:r>
+      <w:r>
+        <w:rPr>
+          <w:b/>
+        </w:rPr>
+        <w:t xml:space="preserve">96 % disent qu’elle a aidé leurs prospects à comprendre leur produit ou service.</w:t>
+      </w:r>
+      <w:r>
+        <w:t xml:space="preserve"> </w:t>
+      </w:r>
+      <w:r>
+        <w:t xml:space="preserve">Trois chiffres tirés du rapport annuel</w:t>
+      </w:r>
+      <w:r>
+        <w:t xml:space="preserve"> </w:t>
+      </w:r>
+      <w:hyperlink r:id="rId33">
         <w:r>
           <w:rPr>
             <w:rStyle w:val="Hyperlink"/>
           </w:rPr>
-          <w:t xml:space="preserve">HubSpot Marketing Statistics</w:t>
+          <w:t xml:space="preserve">Wyzowl State of Video Marketing 2024</w:t>
         </w:r>
       </w:hyperlink>
       <w:r>
-        <w:t xml:space="preserve">). Tu n’as pas le luxe de cette durée d’attention sur du texte.</w:t>
+        <w:t xml:space="preserve"> </w:t>
+      </w:r>
+      <w:r>
+        <w:t xml:space="preserve">— l’enquête de référence sur le marketing vidéo, basée sur 600+ marketeurs interrogés.</w:t>
+      </w:r>
+    </w:p>
+    <w:p>
+      <w:pPr>
+        <w:pStyle w:val="BodyText"/>
+      </w:pPr>
+      <w:r>
+        <w:t xml:space="preserve">Les entreprises qui utilisent la vidéo voient leurs revenus croître</w:t>
+      </w:r>
+      <w:r>
+        <w:t xml:space="preserve"> </w:t>
+      </w:r>
+      <w:r>
+        <w:rPr>
+          <w:b/>
+        </w:rPr>
+        <w:t xml:space="preserve">49 % plus vite</w:t>
+      </w:r>
+      <w:r>
+        <w:t xml:space="preserve"> </w:t>
+      </w:r>
+      <w:r>
+        <w:t xml:space="preserve">que celles qui ne l’utilisent pas (étude Aberdeen Group, citée par</w:t>
+      </w:r>
+      <w:r>
+        <w:t xml:space="preserve"> </w:t>
+      </w:r>
+      <w:hyperlink r:id="rId41">
+        <w:r>
+          <w:rPr>
+            <w:rStyle w:val="Hyperlink"/>
+          </w:rPr>
+          <w:t xml:space="preserve">Vidyard</w:t>
+        </w:r>
+      </w:hyperlink>
+      <w:r>
+        <w:t xml:space="preserve">).</w:t>
+      </w:r>
+    </w:p>
+    <w:p>
+      <w:pPr>
+        <w:pStyle w:val="BodyText"/>
+      </w:pPr>
+      <w:r>
+        <w:t xml:space="preserve">Forrester Research a calculé qu’</w:t>
+      </w:r>
+      <w:r>
+        <w:rPr>
+          <w:b/>
+        </w:rPr>
+        <w:t xml:space="preserve">1 minute de vidéo équivaut à 1,8 million de mots écrits</w:t>
+      </w:r>
+      <w:r>
+        <w:t xml:space="preserve"> </w:t>
+      </w:r>
+      <w:r>
+        <w:t xml:space="preserve">en termes d’impact (Dr James McQuivey, étude Forrester). Tu ne peux pas faire ça avec un article de blog.</w:t>
       </w:r>
     </w:p>
     <w:p>
       <w:pPr>
         <w:pStyle w:val="Heading3"/>
       </w:pPr>
-      <w:bookmarkStart w:id="40" w:name="Xbe67b42ee73fcd549e662a65e7d95c9499b3376"/>
-      <w:r>
-        <w:t xml:space="preserve">2.2. Le contenu interactif convertit 2 fois plus que le passif</w:t>
-      </w:r>
-      <w:bookmarkEnd w:id="40"/>
+      <w:bookmarkStart w:id="42" w:name="X7fabbe84fb560c2391d5e7da65c4a93061cb4a7"/>
+      <w:r>
+        <w:t xml:space="preserve">2.2. Tes lecteurs te lâchent en 15 secondes sur ta page de blog. Avec une vidéo, ils restent 2 fois plus longtemps.</w:t>
+      </w:r>
+      <w:bookmarkEnd w:id="42"/>
     </w:p>
     <w:p>
       <w:pPr>
         <w:pStyle w:val="FirstParagraph"/>
       </w:pPr>
-      <w:hyperlink r:id="rId41">
+      <w:r>
+        <w:rPr>
+          <w:b/>
+        </w:rPr>
+        <w:t xml:space="preserve">55 % des visiteurs passent moins de 15 secondes sur une page web</w:t>
+      </w:r>
+      <w:r>
+        <w:t xml:space="preserve"> </w:t>
+      </w:r>
+      <w:r>
+        <w:t xml:space="preserve">(</w:t>
+      </w:r>
+      <w:hyperlink r:id="rId32">
+        <w:r>
+          <w:rPr>
+            <w:rStyle w:val="Hyperlink"/>
+          </w:rPr>
+          <w:t xml:space="preserve">Chartbeat</w:t>
+        </w:r>
+      </w:hyperlink>
+      <w:r>
+        <w:t xml:space="preserve">). Ton contenu text-only, peu importe sa qualité, perd la moitié de ton audience avant la fin du premier paragraphe.</w:t>
+      </w:r>
+    </w:p>
+    <w:p>
+      <w:pPr>
+        <w:pStyle w:val="BodyText"/>
+      </w:pPr>
+      <w:r>
+        <w:t xml:space="preserve">Avec une vidéo intégrée,</w:t>
+      </w:r>
+      <w:r>
+        <w:t xml:space="preserve"> </w:t>
+      </w:r>
+      <w:r>
+        <w:rPr>
+          <w:b/>
+        </w:rPr>
+        <w:t xml:space="preserve">les visiteurs passent 2,6 fois plus de temps sur la page</w:t>
+      </w:r>
+      <w:r>
+        <w:t xml:space="preserve"> </w:t>
+      </w:r>
+      <w:r>
+        <w:t xml:space="preserve">(</w:t>
+      </w:r>
+      <w:hyperlink r:id="rId43">
+        <w:r>
+          <w:rPr>
+            <w:rStyle w:val="Hyperlink"/>
+          </w:rPr>
+          <w:t xml:space="preserve">Wistia State of Video Report 2024</w:t>
+        </w:r>
+      </w:hyperlink>
+      <w:r>
+        <w:t xml:space="preserve">). Et le taux de conversion d’une page avec vidéo est en moyenne</w:t>
+      </w:r>
+      <w:r>
+        <w:t xml:space="preserve"> </w:t>
+      </w:r>
+      <w:r>
+        <w:rPr>
+          <w:b/>
+        </w:rPr>
+        <w:t xml:space="preserve">80 % plus élevé</w:t>
+      </w:r>
+      <w:r>
+        <w:t xml:space="preserve"> </w:t>
+      </w:r>
+      <w:r>
+        <w:t xml:space="preserve">qu’une page sans vidéo (étude Eyeview Digital, citée par</w:t>
+      </w:r>
+      <w:r>
+        <w:t xml:space="preserve"> </w:t>
+      </w:r>
+      <w:hyperlink r:id="rId44">
+        <w:r>
+          <w:rPr>
+            <w:rStyle w:val="Hyperlink"/>
+          </w:rPr>
+          <w:t xml:space="preserve">HubSpot</w:t>
+        </w:r>
+      </w:hyperlink>
+      <w:r>
+        <w:t xml:space="preserve">).</w:t>
+      </w:r>
+    </w:p>
+    <w:p>
+      <w:pPr>
+        <w:pStyle w:val="BodyText"/>
+      </w:pPr>
+      <w:r>
+        <w:t xml:space="preserve">Le simple fait d’ajouter une vidéo retient ton lecteur. Le quiz vidéo va plus loin : il transforme ce temps passé en contact qualifié.</w:t>
+      </w:r>
+    </w:p>
+    <w:p>
+      <w:pPr>
+        <w:pStyle w:val="Heading3"/>
+      </w:pPr>
+      <w:bookmarkStart w:id="45" w:name="Xf8ce023acd47423bf7faf4a30993bf421f66086"/>
+      <w:r>
+        <w:t xml:space="preserve">2.3. Le contenu interactif convertit 2 fois plus que le contenu passif</w:t>
+      </w:r>
+      <w:bookmarkEnd w:id="45"/>
+    </w:p>
+    <w:p>
+      <w:pPr>
+        <w:pStyle w:val="FirstParagraph"/>
+      </w:pPr>
+      <w:r>
+        <w:rPr>
+          <w:b/>
+        </w:rPr>
+        <w:t xml:space="preserve">Le contenu interactif (quiz, calculatrice, sondage) génère 2 fois plus de conversions que le contenu passif</w:t>
+      </w:r>
+      <w:r>
+        <w:t xml:space="preserve"> </w:t>
+      </w:r>
+      <w:r>
+        <w:t xml:space="preserve">(vidéo seule, ebook, article) selon</w:t>
+      </w:r>
+      <w:r>
+        <w:t xml:space="preserve"> </w:t>
+      </w:r>
+      <w:hyperlink r:id="rId46">
         <w:r>
           <w:rPr>
             <w:rStyle w:val="Hyperlink"/>
@@ -786,103 +1112,295 @@
         <w:t xml:space="preserve"> </w:t>
       </w:r>
       <w:r>
-        <w:t xml:space="preserve">confirme que tout contenu interactif (quiz, calculatrice, sondage embarqué) génère 2 fois plus de conversions que le contenu passif (vidéo seule, ebook, article).</w:t>
+        <w:t xml:space="preserve">et</w:t>
+      </w:r>
+      <w:r>
+        <w:t xml:space="preserve"> </w:t>
+      </w:r>
+      <w:hyperlink r:id="rId47">
+        <w:r>
+          <w:rPr>
+            <w:rStyle w:val="Hyperlink"/>
+          </w:rPr>
+          <w:t xml:space="preserve">Demand Metric</w:t>
+        </w:r>
+      </w:hyperlink>
+      <w:r>
+        <w:t xml:space="preserve">.</w:t>
+      </w:r>
+    </w:p>
+    <w:p>
+      <w:pPr>
+        <w:pStyle w:val="BodyText"/>
+      </w:pPr>
+      <w:r>
+        <w:rPr>
+          <w:b/>
+        </w:rPr>
+        <w:t xml:space="preserve">70 % des marketeurs disent que le contenu interactif convertit efficacement</w:t>
+      </w:r>
+      <w:r>
+        <w:t xml:space="preserve"> </w:t>
+      </w:r>
+      <w:r>
+        <w:t xml:space="preserve">(Outgrow).</w:t>
+      </w:r>
+      <w:r>
+        <w:t xml:space="preserve"> </w:t>
+      </w:r>
+      <w:r>
+        <w:rPr>
+          <w:b/>
+        </w:rPr>
+        <w:t xml:space="preserve">88 % disent qu’il les différencie de leurs concurrents</w:t>
+      </w:r>
+      <w:r>
+        <w:t xml:space="preserve"> </w:t>
+      </w:r>
+      <w:r>
+        <w:t xml:space="preserve">(</w:t>
+      </w:r>
+      <w:hyperlink r:id="rId48">
+        <w:r>
+          <w:rPr>
+            <w:rStyle w:val="Hyperlink"/>
+          </w:rPr>
+          <w:t xml:space="preserve">Content Marketing Institute</w:t>
+        </w:r>
+      </w:hyperlink>
+      <w:r>
+        <w:t xml:space="preserve">).</w:t>
+      </w:r>
+    </w:p>
+    <w:p>
+      <w:pPr>
+        <w:pStyle w:val="BodyText"/>
+      </w:pPr>
+      <w:r>
+        <w:t xml:space="preserve">Pourquoi ? Parce que ton visiteur n’est plus un spectateur. Il est acteur. Il clique, il choisit, il s’investit. Et un visiteur investi devient un contact qualifié 2 fois plus souvent qu’un spectateur passif.</w:t>
       </w:r>
     </w:p>
     <w:p>
       <w:pPr>
         <w:pStyle w:val="Heading3"/>
       </w:pPr>
-      <w:bookmarkStart w:id="42" w:name="X50778584e5a60f36a56bed79d5527af177cfa1f"/>
-      <w:r>
-        <w:t xml:space="preserve">2.3. Le quiz garde tes spectateurs plus longtemps sur la vidéo</w:t>
-      </w:r>
-      <w:bookmarkEnd w:id="42"/>
+      <w:bookmarkStart w:id="49" w:name="Xc012973d05628536dd0abc7ac779b8535a98308"/>
+      <w:r>
+        <w:t xml:space="preserve">2.4. Un quiz capte 33 % des visiteurs en moyenne. Un opt-in classique en capte 2 à 3 %.</w:t>
+      </w:r>
+      <w:bookmarkEnd w:id="49"/>
     </w:p>
     <w:p>
       <w:pPr>
         <w:pStyle w:val="FirstParagraph"/>
       </w:pPr>
       <w:r>
-        <w:t xml:space="preserve">Quand tu sais qu’un quiz va apparaître à 0:30, tu ne fermes pas la vidéo à 0:25. Tu attends. Le simple fait d’avoir des moments-quiz multiplie le temps de visionnage moyen.</w:t>
+        <w:rPr>
+          <w:b/>
+        </w:rPr>
+        <w:t xml:space="preserve">Le taux moyen de capture d’un quiz lead-magnet est de 33,6 %</w:t>
+      </w:r>
+      <w:r>
+        <w:t xml:space="preserve"> </w:t>
+      </w:r>
+      <w:r>
+        <w:t xml:space="preserve">selon</w:t>
+      </w:r>
+      <w:r>
+        <w:t xml:space="preserve"> </w:t>
+      </w:r>
+      <w:hyperlink r:id="rId50">
+        <w:r>
+          <w:rPr>
+            <w:rStyle w:val="Hyperlink"/>
+          </w:rPr>
+          <w:t xml:space="preserve">Interact Quiz Marketing Statistics</w:t>
+        </w:r>
+      </w:hyperlink>
+      <w:r>
+        <w:t xml:space="preserve"> </w:t>
+      </w:r>
+      <w:r>
+        <w:t xml:space="preserve">— basé sur l’analyse de centaines de quiz publiés sur leur plateforme.</w:t>
+      </w:r>
+    </w:p>
+    <w:p>
+      <w:pPr>
+        <w:pStyle w:val="BodyText"/>
+      </w:pPr>
+      <w:r>
+        <w:t xml:space="preserve">Pour comparer : le taux moyen de conversion d’un opt-in classique avec ebook gratuit est de</w:t>
+      </w:r>
+      <w:r>
+        <w:t xml:space="preserve"> </w:t>
+      </w:r>
+      <w:r>
+        <w:rPr>
+          <w:b/>
+        </w:rPr>
+        <w:t xml:space="preserve">2 à 3 %</w:t>
+      </w:r>
+      <w:r>
+        <w:t xml:space="preserve"> </w:t>
+      </w:r>
+      <w:r>
+        <w:t xml:space="preserve">(</w:t>
+      </w:r>
+      <w:hyperlink r:id="rId51">
+        <w:r>
+          <w:rPr>
+            <w:rStyle w:val="Hyperlink"/>
+          </w:rPr>
+          <w:t xml:space="preserve">Sumo</w:t>
+        </w:r>
+      </w:hyperlink>
+      <w:r>
+        <w:t xml:space="preserve"> </w:t>
+      </w:r>
+      <w:r>
+        <w:t xml:space="preserve">/</w:t>
+      </w:r>
+      <w:r>
+        <w:t xml:space="preserve"> </w:t>
+      </w:r>
+      <w:hyperlink r:id="rId52">
+        <w:r>
+          <w:rPr>
+            <w:rStyle w:val="Hyperlink"/>
+          </w:rPr>
+          <w:t xml:space="preserve">GetResponse Email Marketing Benchmarks</w:t>
+        </w:r>
+      </w:hyperlink>
+      <w:r>
+        <w:t xml:space="preserve">).</w:t>
+      </w:r>
+    </w:p>
+    <w:p>
+      <w:pPr>
+        <w:pStyle w:val="BodyText"/>
+      </w:pPr>
+      <w:r>
+        <w:rPr>
+          <w:b/>
+        </w:rPr>
+        <w:t xml:space="preserve">Sur le même trafic, le quiz capture 10 à 15 fois plus de contacts qu’un ebook gratuit.</w:t>
+      </w:r>
+      <w:r>
+        <w:t xml:space="preserve"> </w:t>
+      </w:r>
+      <w:r>
+        <w:t xml:space="preserve">C’est pas marginal, c’est un changement de catégorie.</w:t>
+      </w:r>
+    </w:p>
+    <w:p>
+      <w:pPr>
+        <w:pStyle w:val="BodyText"/>
+      </w:pPr>
+      <w:r>
+        <w:t xml:space="preserve">Et avec un quiz vidéo, tu joues sur les deux tableaux : la rétention de la vidéo + la conversion du quiz. Le résultat te dépasse les deux pris séparément.</w:t>
       </w:r>
     </w:p>
     <w:p>
       <w:pPr>
         <w:pStyle w:val="Heading3"/>
       </w:pPr>
-      <w:bookmarkStart w:id="43" w:name="tu-récupères-un-contact-déjà-rangé"/>
-      <w:r>
-        <w:t xml:space="preserve">2.4. Tu récupères un contact déjà rangé</w:t>
-      </w:r>
-      <w:bookmarkEnd w:id="43"/>
+      <w:bookmarkStart w:id="53" w:name="X6c07246626457da22d6f9052db7918af03aaa6e"/>
+      <w:r>
+        <w:t xml:space="preserve">2.5. La vidéo interactive multiplie l’engagement par 5</w:t>
+      </w:r>
+      <w:bookmarkEnd w:id="53"/>
     </w:p>
     <w:p>
       <w:pPr>
         <w:pStyle w:val="FirstParagraph"/>
       </w:pPr>
       <w:r>
-        <w:t xml:space="preserve">À la fin du quiz vidéo, ton contact n’est pas juste un email. C’est un contact avec un profil (</w:t>
-      </w:r>
-      <w:r>
-        <w:t xml:space="preserve">“</w:t>
-      </w:r>
-      <w:r>
-        <w:t xml:space="preserve">Profil Motivée</w:t>
-      </w:r>
-      <w:r>
-        <w:t xml:space="preserve">”</w:t>
-      </w:r>
-      <w:r>
-        <w:t xml:space="preserve">,</w:t>
-      </w:r>
-      <w:r>
-        <w:t xml:space="preserve"> </w:t>
-      </w:r>
-      <w:r>
-        <w:t xml:space="preserve">“</w:t>
-      </w:r>
-      <w:r>
-        <w:t xml:space="preserve">Profil Pragmatique</w:t>
-      </w:r>
-      <w:r>
-        <w:t xml:space="preserve">”</w:t>
-      </w:r>
-      <w:r>
-        <w:t xml:space="preserve">,</w:t>
-      </w:r>
-      <w:r>
-        <w:t xml:space="preserve"> </w:t>
-      </w:r>
-      <w:r>
-        <w:t xml:space="preserve">“</w:t>
-      </w:r>
-      <w:r>
-        <w:t xml:space="preserve">Profil Premium</w:t>
-      </w:r>
-      <w:r>
-        <w:t xml:space="preserve">”</w:t>
-      </w:r>
-      <w:r>
-        <w:t xml:space="preserve">…) qui déclenche directement la bonne suite d’emails dans ton Systeme io.</w:t>
-      </w:r>
-    </w:p>
-    <w:p>
-      <w:pPr>
-        <w:pStyle w:val="Heading3"/>
-      </w:pPr>
-      <w:bookmarkStart w:id="44" w:name="X292fd391ed97bd655411eb7c331c1d45ff147cf"/>
-      <w:r>
-        <w:t xml:space="preserve">2.5. Tu réutilises du contenu vidéo qui existe déjà</w:t>
-      </w:r>
-      <w:bookmarkEnd w:id="44"/>
-    </w:p>
-    <w:p>
-      <w:pPr>
-        <w:pStyle w:val="FirstParagraph"/>
-      </w:pPr>
-      <w:r>
-        <w:t xml:space="preserve">Pas besoin de tourner une nouvelle vidéo. Tu prends une vidéo qui parle déjà à ton audience (la tienne ou celle d’un autre), et tu la transformes en machine à contacts. C’est la mécanique la plus rentable du marketing 2026.</w:t>
+        <w:rPr>
+          <w:b/>
+        </w:rPr>
+        <w:t xml:space="preserve">Une vidéo interactive génère 5 fois plus d’engagement qu’une vidéo linéaire</w:t>
+      </w:r>
+      <w:r>
+        <w:t xml:space="preserve"> </w:t>
+      </w:r>
+      <w:r>
+        <w:t xml:space="preserve">(</w:t>
+      </w:r>
+      <w:hyperlink r:id="rId54">
+        <w:r>
+          <w:rPr>
+            <w:rStyle w:val="Hyperlink"/>
+          </w:rPr>
+          <w:t xml:space="preserve">Demand Gen Report</w:t>
+        </w:r>
+      </w:hyperlink>
+      <w:r>
+        <w:t xml:space="preserve">).</w:t>
+      </w:r>
+    </w:p>
+    <w:p>
+      <w:pPr>
+        <w:pStyle w:val="BodyText"/>
+      </w:pPr>
+      <w:r>
+        <w:rPr>
+          <w:b/>
+        </w:rPr>
+        <w:t xml:space="preserve">Les vidéos interactives ont un taux de complétion 50 % supérieur</w:t>
+      </w:r>
+      <w:r>
+        <w:t xml:space="preserve"> </w:t>
+      </w:r>
+      <w:r>
+        <w:t xml:space="preserve">aux vidéos non interactives (</w:t>
+      </w:r>
+      <w:hyperlink r:id="rId55">
+        <w:r>
+          <w:rPr>
+            <w:rStyle w:val="Hyperlink"/>
+          </w:rPr>
+          <w:t xml:space="preserve">Wibbitz Video Marketing Statistics</w:t>
+        </w:r>
+      </w:hyperlink>
+      <w:r>
+        <w:t xml:space="preserve">).</w:t>
+      </w:r>
+    </w:p>
+    <w:p>
+      <w:pPr>
+        <w:pStyle w:val="BodyText"/>
+      </w:pPr>
+      <w:r>
+        <w:rPr>
+          <w:b/>
+        </w:rPr>
+        <w:t xml:space="preserve">89 % des consommateurs disent vouloir voir plus de vidéos de la part des marques</w:t>
+      </w:r>
+      <w:r>
+        <w:t xml:space="preserve"> </w:t>
+      </w:r>
+      <w:r>
+        <w:t xml:space="preserve">en 2024 (Wyzowl). Et</w:t>
+      </w:r>
+      <w:r>
+        <w:t xml:space="preserve"> </w:t>
+      </w:r>
+      <w:r>
+        <w:rPr>
+          <w:b/>
+        </w:rPr>
+        <w:t xml:space="preserve">interactivité = vidéo qu’on partage</w:t>
+      </w:r>
+      <w:r>
+        <w:t xml:space="preserve">.</w:t>
+      </w:r>
+    </w:p>
+    <w:p>
+      <w:pPr>
+        <w:pStyle w:val="BodyText"/>
+      </w:pPr>
+      <w:r>
+        <w:t xml:space="preserve">Le quiz vidéo coche les trois cases : engagement multiplié, complétion en hausse, partage facilité. Tu ne fais pas un effort marketing supplémentaire — tu transformes ce que tu as déjà en quelque chose de bien plus rentable.</w:t>
       </w:r>
     </w:p>
     <w:p>
@@ -896,21 +1414,21 @@
       <w:pPr>
         <w:pStyle w:val="Heading2"/>
       </w:pPr>
-      <w:bookmarkStart w:id="45" w:name="Xfd5a28d68888559daded8b4d79e536f06e67156"/>
-      <w:r>
-        <w:t xml:space="preserve">Section 3 — Glisser un quiz dans une vidéo YouTube, sans rien voler</w:t>
-      </w:r>
-      <w:bookmarkEnd w:id="45"/>
+      <w:bookmarkStart w:id="56" w:name="X26190a0b47fb1419c553e5c3c1627a6c4ddc2ae"/>
+      <w:r>
+        <w:t xml:space="preserve">Section 3 — Glisser un quiz sur n’importe quelle vidéo YouTube (sans rien voler à personne)</w:t>
+      </w:r>
+      <w:bookmarkEnd w:id="56"/>
     </w:p>
     <w:p>
       <w:pPr>
         <w:pStyle w:val="Heading3"/>
       </w:pPr>
-      <w:bookmarkStart w:id="46" w:name="ce-que-tu-as-le-droit-de-faire"/>
+      <w:bookmarkStart w:id="57" w:name="ce-que-tu-as-le-droit-de-faire"/>
       <w:r>
         <w:t xml:space="preserve">Ce que tu as le droit de faire</w:t>
       </w:r>
-      <w:bookmarkEnd w:id="46"/>
+      <w:bookmarkEnd w:id="57"/>
     </w:p>
     <w:p>
       <w:pPr>
@@ -976,11 +1494,11 @@
       <w:pPr>
         <w:pStyle w:val="Heading3"/>
       </w:pPr>
-      <w:bookmarkStart w:id="47" w:name="quelles-vidéos-tu-peux-utiliser"/>
+      <w:bookmarkStart w:id="58" w:name="quelles-vidéos-tu-peux-utiliser"/>
       <w:r>
         <w:t xml:space="preserve">Quelles vidéos tu peux utiliser</w:t>
       </w:r>
-      <w:bookmarkEnd w:id="47"/>
+      <w:bookmarkEnd w:id="58"/>
     </w:p>
     <w:p>
       <w:pPr>
@@ -1112,11 +1630,11 @@
       <w:pPr>
         <w:pStyle w:val="Heading3"/>
       </w:pPr>
-      <w:bookmarkStart w:id="48" w:name="ce-que-tu-nas-pas-le-droit-de-faire"/>
+      <w:bookmarkStart w:id="59" w:name="ce-que-tu-nas-pas-le-droit-de-faire"/>
       <w:r>
         <w:t xml:space="preserve">Ce que tu n’as PAS le droit de faire</w:t>
       </w:r>
-      <w:bookmarkEnd w:id="48"/>
+      <w:bookmarkEnd w:id="59"/>
     </w:p>
     <w:p>
       <w:pPr>
@@ -1185,21 +1703,21 @@
       <w:pPr>
         <w:pStyle w:val="Heading2"/>
       </w:pPr>
-      <w:bookmarkStart w:id="49" w:name="section-4-7-cas-dusage-concrets"/>
-      <w:r>
-        <w:t xml:space="preserve">Section 4 — 7 cas d’usage concrets</w:t>
-      </w:r>
-      <w:bookmarkEnd w:id="49"/>
+      <w:bookmarkStart w:id="60" w:name="Xd053355f418dbb72566dcab38ee04d49cb0e83c"/>
+      <w:r>
+        <w:t xml:space="preserve">Section 4 — 7 façons de transformer une vidéo en machine à contacts</w:t>
+      </w:r>
+      <w:bookmarkEnd w:id="60"/>
     </w:p>
     <w:p>
       <w:pPr>
         <w:pStyle w:val="Heading3"/>
       </w:pPr>
-      <w:bookmarkStart w:id="50" w:name="Xf68e8a5fd34194ddef707e4aacb155fa3aeb6e5"/>
+      <w:bookmarkStart w:id="61" w:name="Xf68e8a5fd34194ddef707e4aacb155fa3aeb6e5"/>
       <w:r>
         <w:t xml:space="preserve">4.1. Le coach business qui transforme sa chaîne YouTube en pipeline</w:t>
       </w:r>
-      <w:bookmarkEnd w:id="50"/>
+      <w:bookmarkEnd w:id="61"/>
     </w:p>
     <w:p>
       <w:pPr>
@@ -1270,11 +1788,11 @@
       <w:pPr>
         <w:pStyle w:val="Heading3"/>
       </w:pPr>
-      <w:bookmarkStart w:id="51" w:name="X213d937b06b685f31ab6bd7223d3e737f435970"/>
+      <w:bookmarkStart w:id="62" w:name="X213d937b06b685f31ab6bd7223d3e737f435970"/>
       <w:r>
         <w:t xml:space="preserve">4.2. La formatrice qui glisse un quiz dans son webinaire replay</w:t>
       </w:r>
-      <w:bookmarkEnd w:id="51"/>
+      <w:bookmarkEnd w:id="62"/>
     </w:p>
     <w:p>
       <w:pPr>
@@ -1339,11 +1857,11 @@
       <w:pPr>
         <w:pStyle w:val="Heading3"/>
       </w:pPr>
-      <w:bookmarkStart w:id="52" w:name="Xf1796eb30b50f33a6159dddc11ae65abf5ef1bb"/>
+      <w:bookmarkStart w:id="63" w:name="Xf1796eb30b50f33a6159dddc11ae65abf5ef1bb"/>
       <w:r>
         <w:t xml:space="preserve">4.3. Le créateur de contenu qui s’appuie sur une vidéo virale</w:t>
       </w:r>
-      <w:bookmarkEnd w:id="52"/>
+      <w:bookmarkEnd w:id="63"/>
     </w:p>
     <w:p>
       <w:pPr>
@@ -1423,11 +1941,11 @@
       <w:pPr>
         <w:pStyle w:val="Heading3"/>
       </w:pPr>
-      <w:bookmarkStart w:id="53" w:name="X417e73daeb6ef1634d0f10fcc8f1c7b3f7b1308"/>
+      <w:bookmarkStart w:id="64" w:name="X417e73daeb6ef1634d0f10fcc8f1c7b3f7b1308"/>
       <w:r>
         <w:t xml:space="preserve">4.4. L’affilié qui pré-trie sur une démo produit</w:t>
       </w:r>
-      <w:bookmarkEnd w:id="53"/>
+      <w:bookmarkEnd w:id="64"/>
     </w:p>
     <w:p>
       <w:pPr>
@@ -1498,11 +2016,11 @@
       <w:pPr>
         <w:pStyle w:val="Heading3"/>
       </w:pPr>
-      <w:bookmarkStart w:id="54" w:name="X2957c02d3b0cdc435e9054fb2ee93b7fa3bb0a2"/>
+      <w:bookmarkStart w:id="65" w:name="X2957c02d3b0cdc435e9054fb2ee93b7fa3bb0a2"/>
       <w:r>
         <w:t xml:space="preserve">4.5. Le formateur qui rend un module de cours interactif</w:t>
       </w:r>
-      <w:bookmarkEnd w:id="54"/>
+      <w:bookmarkEnd w:id="65"/>
     </w:p>
     <w:p>
       <w:pPr>
@@ -1555,11 +2073,11 @@
       <w:pPr>
         <w:pStyle w:val="Heading3"/>
       </w:pPr>
-      <w:bookmarkStart w:id="55" w:name="X0240489251ddc264d839155ba4b1f5cebc1135b"/>
+      <w:bookmarkStart w:id="66" w:name="X0240489251ddc264d839155ba4b1f5cebc1135b"/>
       <w:r>
         <w:t xml:space="preserve">4.6. Le coach qui pré-trie ses appels découverte</w:t>
       </w:r>
-      <w:bookmarkEnd w:id="55"/>
+      <w:bookmarkEnd w:id="66"/>
     </w:p>
     <w:p>
       <w:pPr>
@@ -1645,11 +2163,11 @@
       <w:pPr>
         <w:pStyle w:val="Heading3"/>
       </w:pPr>
-      <w:bookmarkStart w:id="56" w:name="X5cff4e2f853416084b87d63646d3d6bf2b19e7e"/>
+      <w:bookmarkStart w:id="67" w:name="X5cff4e2f853416084b87d63646d3d6bf2b19e7e"/>
       <w:r>
         <w:t xml:space="preserve">4.7. Le solopreneur qui valide ses ventes en avance</w:t>
       </w:r>
-      <w:bookmarkEnd w:id="56"/>
+      <w:bookmarkEnd w:id="67"/>
     </w:p>
     <w:p>
       <w:pPr>
@@ -1754,11 +2272,11 @@
       <w:pPr>
         <w:pStyle w:val="Heading2"/>
       </w:pPr>
-      <w:bookmarkStart w:id="57" w:name="Xed18b76b9de766d4d60b601c4bf9f6e091102fe"/>
-      <w:r>
-        <w:t xml:space="preserve">Section 5 — Comment créer ton premier Popquiz dans Tiquiz</w:t>
-      </w:r>
-      <w:bookmarkEnd w:id="57"/>
+      <w:bookmarkStart w:id="68" w:name="X4ccaf146401ef28ef4652b6b52b948e3c81af54"/>
+      <w:r>
+        <w:t xml:space="preserve">Section 5 — Ton premier Popquiz en 30 minutes (étape par étape)</w:t>
+      </w:r>
+      <w:bookmarkEnd w:id="68"/>
     </w:p>
     <w:p>
       <w:pPr>
@@ -1772,11 +2290,11 @@
       <w:pPr>
         <w:pStyle w:val="Heading3"/>
       </w:pPr>
-      <w:bookmarkStart w:id="58" w:name="X6e719d157f618923f3590677b23af8eeb15370f"/>
+      <w:bookmarkStart w:id="69" w:name="X6e719d157f618923f3590677b23af8eeb15370f"/>
       <w:r>
         <w:t xml:space="preserve">Étape 1 — Tu prépares ton ou tes quiz (5 min)</w:t>
       </w:r>
-      <w:bookmarkEnd w:id="58"/>
+      <w:bookmarkEnd w:id="69"/>
     </w:p>
     <w:p>
       <w:pPr>
@@ -1790,11 +2308,11 @@
       <w:pPr>
         <w:pStyle w:val="Heading3"/>
       </w:pPr>
-      <w:bookmarkStart w:id="59" w:name="étape-2-tu-vas-sur-popquiznew"/>
+      <w:bookmarkStart w:id="70" w:name="étape-2-tu-vas-sur-popquiznew"/>
       <w:r>
         <w:t xml:space="preserve">Étape 2 — Tu vas sur /popquiz/new</w:t>
       </w:r>
-      <w:bookmarkEnd w:id="59"/>
+      <w:bookmarkEnd w:id="70"/>
     </w:p>
     <w:p>
       <w:pPr>
@@ -1823,11 +2341,11 @@
       <w:pPr>
         <w:pStyle w:val="Heading3"/>
       </w:pPr>
-      <w:bookmarkStart w:id="60" w:name="étape-3-tu-choisis-ta-vidéo"/>
+      <w:bookmarkStart w:id="71" w:name="étape-3-tu-choisis-ta-vidéo"/>
       <w:r>
         <w:t xml:space="preserve">Étape 3 — Tu choisis ta vidéo</w:t>
       </w:r>
-      <w:bookmarkEnd w:id="60"/>
+      <w:bookmarkEnd w:id="71"/>
     </w:p>
     <w:p>
       <w:pPr>
@@ -1883,11 +2401,11 @@
       <w:pPr>
         <w:pStyle w:val="Heading3"/>
       </w:pPr>
-      <w:bookmarkStart w:id="61" w:name="étape-4-tu-places-tes-moments-quiz"/>
+      <w:bookmarkStart w:id="72" w:name="étape-4-tu-places-tes-moments-quiz"/>
       <w:r>
         <w:t xml:space="preserve">Étape 4 — Tu places tes moments-quiz</w:t>
       </w:r>
-      <w:bookmarkEnd w:id="61"/>
+      <w:bookmarkEnd w:id="72"/>
     </w:p>
     <w:p>
       <w:pPr>
@@ -1951,11 +2469,11 @@
       <w:pPr>
         <w:pStyle w:val="Heading3"/>
       </w:pPr>
-      <w:bookmarkStart w:id="62" w:name="étape-5-tu-publies"/>
+      <w:bookmarkStart w:id="73" w:name="étape-5-tu-publies"/>
       <w:r>
         <w:t xml:space="preserve">Étape 5 — Tu publies</w:t>
       </w:r>
-      <w:bookmarkEnd w:id="62"/>
+      <w:bookmarkEnd w:id="73"/>
     </w:p>
     <w:p>
       <w:pPr>
@@ -2020,11 +2538,11 @@
       <w:pPr>
         <w:pStyle w:val="Heading3"/>
       </w:pPr>
-      <w:bookmarkStart w:id="63" w:name="étape-6-tu-intègres"/>
+      <w:bookmarkStart w:id="74" w:name="étape-6-tu-intègres"/>
       <w:r>
         <w:t xml:space="preserve">Étape 6 — Tu intègres</w:t>
       </w:r>
-      <w:bookmarkEnd w:id="63"/>
+      <w:bookmarkEnd w:id="74"/>
     </w:p>
     <w:p>
       <w:pPr>
@@ -2038,11 +2556,11 @@
       <w:pPr>
         <w:pStyle w:val="Heading3"/>
       </w:pPr>
-      <w:bookmarkStart w:id="64" w:name="étape-7-tu-regardes-les-contacts-tomber"/>
+      <w:bookmarkStart w:id="75" w:name="étape-7-tu-regardes-les-contacts-tomber"/>
       <w:r>
         <w:t xml:space="preserve">Étape 7 — Tu regardes les contacts tomber</w:t>
       </w:r>
-      <w:bookmarkEnd w:id="64"/>
+      <w:bookmarkEnd w:id="75"/>
     </w:p>
     <w:p>
       <w:pPr>
@@ -2063,11 +2581,11 @@
       <w:pPr>
         <w:pStyle w:val="Heading2"/>
       </w:pPr>
-      <w:bookmarkStart w:id="65" w:name="Xa6ea8bccd3a2f8a69835637ea9f0e6e5c5bb209"/>
-      <w:r>
-        <w:t xml:space="preserve">Section 6 — Comparaison avec les outils du marché</w:t>
-      </w:r>
-      <w:bookmarkEnd w:id="65"/>
+      <w:bookmarkStart w:id="76" w:name="X63d16e2b199b35a8e8c5a39ed7f497fc5a8bf38"/>
+      <w:r>
+        <w:t xml:space="preserve">Section 6 — Pourquoi tu paies 10 fois moins avec Tiquiz qu’avec un outil US</w:t>
+      </w:r>
+      <w:bookmarkEnd w:id="76"/>
     </w:p>
     <w:tbl>
       <w:tblPr>
@@ -2561,21 +3079,21 @@
       <w:pPr>
         <w:pStyle w:val="Heading2"/>
       </w:pPr>
-      <w:bookmarkStart w:id="66" w:name="section-7-faq"/>
-      <w:r>
-        <w:t xml:space="preserve">Section 7 — FAQ</w:t>
-      </w:r>
-      <w:bookmarkEnd w:id="66"/>
+      <w:bookmarkStart w:id="77" w:name="X62ece92d1720dd10edf6c6a9f2a19afb6a16566"/>
+      <w:r>
+        <w:t xml:space="preserve">Section 7 — Les 10 questions qui reviennent (et les réponses cash)</w:t>
+      </w:r>
+      <w:bookmarkEnd w:id="77"/>
     </w:p>
     <w:p>
       <w:pPr>
         <w:pStyle w:val="Heading3"/>
       </w:pPr>
-      <w:bookmarkStart w:id="67" w:name="Xb9767d865718140520a24815ecb8de9610c4d19"/>
+      <w:bookmarkStart w:id="78" w:name="Xb9767d865718140520a24815ecb8de9610c4d19"/>
       <w:r>
         <w:t xml:space="preserve">Est-ce vraiment légal de glisser un quiz dans une vidéo YouTube ?</w:t>
       </w:r>
-      <w:bookmarkEnd w:id="67"/>
+      <w:bookmarkEnd w:id="78"/>
     </w:p>
     <w:p>
       <w:pPr>
@@ -2589,11 +3107,11 @@
       <w:pPr>
         <w:pStyle w:val="Heading3"/>
       </w:pPr>
-      <w:bookmarkStart w:id="68" w:name="X9b70b320e8c8c7947edfd0b6801b56b14725a26"/>
+      <w:bookmarkStart w:id="79" w:name="X9b70b320e8c8c7947edfd0b6801b56b14725a26"/>
       <w:r>
         <w:t xml:space="preserve">Le créateur de la vidéo perd-il quelque chose ?</w:t>
       </w:r>
-      <w:bookmarkEnd w:id="68"/>
+      <w:bookmarkEnd w:id="79"/>
     </w:p>
     <w:p>
       <w:pPr>
@@ -2607,11 +3125,11 @@
       <w:pPr>
         <w:pStyle w:val="Heading3"/>
       </w:pPr>
-      <w:bookmarkStart w:id="69" w:name="X1f859a34fbad234d8c00901528d011a57483f2d"/>
+      <w:bookmarkStart w:id="80" w:name="X1f859a34fbad234d8c00901528d011a57483f2d"/>
       <w:r>
         <w:t xml:space="preserve">Combien de quiz je peux placer sur une vidéo ?</w:t>
       </w:r>
-      <w:bookmarkEnd w:id="69"/>
+      <w:bookmarkEnd w:id="80"/>
     </w:p>
     <w:p>
       <w:pPr>
@@ -2625,11 +3143,11 @@
       <w:pPr>
         <w:pStyle w:val="Heading3"/>
       </w:pPr>
-      <w:bookmarkStart w:id="70" w:name="X9b5ee9b970d68b3d635f4b70459a803efe80aff"/>
+      <w:bookmarkStart w:id="81" w:name="X9b5ee9b970d68b3d635f4b70459a803efe80aff"/>
       <w:r>
         <w:t xml:space="preserve">Puis-je rendre les quiz obligatoires ou optionnels ?</w:t>
       </w:r>
-      <w:bookmarkEnd w:id="70"/>
+      <w:bookmarkEnd w:id="81"/>
     </w:p>
     <w:p>
       <w:pPr>
@@ -2643,11 +3161,11 @@
       <w:pPr>
         <w:pStyle w:val="Heading3"/>
       </w:pPr>
-      <w:bookmarkStart w:id="71" w:name="comment-je-récupère-les-contacts"/>
+      <w:bookmarkStart w:id="82" w:name="comment-je-récupère-les-contacts"/>
       <w:r>
         <w:t xml:space="preserve">Comment je récupère les contacts ?</w:t>
       </w:r>
-      <w:bookmarkEnd w:id="71"/>
+      <w:bookmarkEnd w:id="82"/>
     </w:p>
     <w:p>
       <w:pPr>
@@ -2661,11 +3179,11 @@
       <w:pPr>
         <w:pStyle w:val="Heading3"/>
       </w:pPr>
-      <w:bookmarkStart w:id="72" w:name="popquiz-est-inclus-dans-le-plan-gratuit"/>
+      <w:bookmarkStart w:id="83" w:name="popquiz-est-inclus-dans-le-plan-gratuit"/>
       <w:r>
         <w:t xml:space="preserve">Popquiz est inclus dans le plan gratuit ?</w:t>
       </w:r>
-      <w:bookmarkEnd w:id="72"/>
+      <w:bookmarkEnd w:id="83"/>
     </w:p>
     <w:p>
       <w:pPr>
@@ -2679,11 +3197,11 @@
       <w:pPr>
         <w:pStyle w:val="Heading3"/>
       </w:pPr>
-      <w:bookmarkStart w:id="73" w:name="quel-format-vidéo-je-peux-utiliser"/>
+      <w:bookmarkStart w:id="84" w:name="quel-format-vidéo-je-peux-utiliser"/>
       <w:r>
         <w:t xml:space="preserve">Quel format vidéo je peux utiliser ?</w:t>
       </w:r>
-      <w:bookmarkEnd w:id="73"/>
+      <w:bookmarkEnd w:id="84"/>
     </w:p>
     <w:p>
       <w:pPr>
@@ -2697,11 +3215,11 @@
       <w:pPr>
         <w:pStyle w:val="Heading3"/>
       </w:pPr>
-      <w:bookmarkStart w:id="74" w:name="le-code-tiquiz-marche-sur-systeme-io"/>
+      <w:bookmarkStart w:id="85" w:name="le-code-tiquiz-marche-sur-systeme-io"/>
       <w:r>
         <w:t xml:space="preserve">Le code Tiquiz marche sur Systeme io ?</w:t>
       </w:r>
-      <w:bookmarkEnd w:id="74"/>
+      <w:bookmarkEnd w:id="85"/>
     </w:p>
     <w:p>
       <w:pPr>
@@ -2733,11 +3251,11 @@
       <w:pPr>
         <w:pStyle w:val="Heading3"/>
       </w:pPr>
-      <w:bookmarkStart w:id="75" w:name="le-quiz-sadapte-au-branding-de-mon-site"/>
+      <w:bookmarkStart w:id="86" w:name="le-quiz-sadapte-au-branding-de-mon-site"/>
       <w:r>
         <w:t xml:space="preserve">Le quiz s’adapte au branding de mon site ?</w:t>
       </w:r>
-      <w:bookmarkEnd w:id="75"/>
+      <w:bookmarkEnd w:id="86"/>
     </w:p>
     <w:p>
       <w:pPr>
@@ -2751,11 +3269,11 @@
       <w:pPr>
         <w:pStyle w:val="Heading3"/>
       </w:pPr>
-      <w:bookmarkStart w:id="76" w:name="et-sur-mobile-ça-marche"/>
+      <w:bookmarkStart w:id="87" w:name="et-sur-mobile-ça-marche"/>
       <w:r>
         <w:t xml:space="preserve">Et sur mobile ça marche ?</w:t>
       </w:r>
-      <w:bookmarkEnd w:id="76"/>
+      <w:bookmarkEnd w:id="87"/>
     </w:p>
     <w:p>
       <w:pPr>
@@ -2776,11 +3294,11 @@
       <w:pPr>
         <w:pStyle w:val="Heading2"/>
       </w:pPr>
-      <w:bookmarkStart w:id="77" w:name="X7897699091ffb0e6d7bb675fd1b9357ff334ca3"/>
-      <w:r>
-        <w:t xml:space="preserve">Section 8 — Prêt à lancer ton premier Popquiz ?</w:t>
-      </w:r>
-      <w:bookmarkEnd w:id="77"/>
+      <w:bookmarkStart w:id="88" w:name="section-8-à-toi-de-jouer"/>
+      <w:r>
+        <w:t xml:space="preserve">Section 8 — À toi de jouer</w:t>
+      </w:r>
+      <w:bookmarkEnd w:id="88"/>
     </w:p>
     <w:p>
       <w:pPr>
@@ -2968,21 +3486,21 @@
       <w:pPr>
         <w:pStyle w:val="Heading2"/>
       </w:pPr>
-      <w:bookmarkStart w:id="78" w:name="Xb8a3b31e4ad3a23cef47c6b15ec1930d4b2f49a"/>
+      <w:bookmarkStart w:id="89" w:name="Xb8a3b31e4ad3a23cef47c6b15ec1930d4b2f49a"/>
       <w:r>
         <w:t xml:space="preserve">Bloc technique pour la mise en ligne (à coller dans Systeme io)</w:t>
       </w:r>
-      <w:bookmarkEnd w:id="78"/>
+      <w:bookmarkEnd w:id="89"/>
     </w:p>
     <w:p>
       <w:pPr>
         <w:pStyle w:val="Heading3"/>
       </w:pPr>
-      <w:bookmarkStart w:id="79" w:name="title-max-60-caractères-1"/>
+      <w:bookmarkStart w:id="90" w:name="title-max-60-caractères-1"/>
       <w:r>
         <w:t xml:space="preserve">Title (max 60 caractères)</w:t>
       </w:r>
-      <w:bookmarkEnd w:id="79"/>
+      <w:bookmarkEnd w:id="90"/>
     </w:p>
     <w:p>
       <w:pPr>
@@ -2996,11 +3514,11 @@
       <w:pPr>
         <w:pStyle w:val="Heading3"/>
       </w:pPr>
-      <w:bookmarkStart w:id="80" w:name="meta-description-max-155-caractères-1"/>
+      <w:bookmarkStart w:id="91" w:name="meta-description-max-155-caractères-1"/>
       <w:r>
         <w:t xml:space="preserve">Meta description (max 155 caractères)</w:t>
       </w:r>
-      <w:bookmarkEnd w:id="80"/>
+      <w:bookmarkEnd w:id="91"/>
     </w:p>
     <w:p>
       <w:pPr>
@@ -3014,11 +3532,11 @@
       <w:pPr>
         <w:pStyle w:val="Heading3"/>
       </w:pPr>
-      <w:bookmarkStart w:id="81" w:name="slug"/>
+      <w:bookmarkStart w:id="92" w:name="slug"/>
       <w:r>
         <w:t xml:space="preserve">Slug</w:t>
       </w:r>
-      <w:bookmarkEnd w:id="81"/>
+      <w:bookmarkEnd w:id="92"/>
     </w:p>
     <w:p>
       <w:pPr>
@@ -3032,11 +3550,11 @@
       <w:pPr>
         <w:pStyle w:val="Heading3"/>
       </w:pPr>
-      <w:bookmarkStart w:id="82" w:name="mots-clés-ciblés"/>
+      <w:bookmarkStart w:id="93" w:name="mots-clés-ciblés"/>
       <w:r>
         <w:t xml:space="preserve">Mots-clés ciblés</w:t>
       </w:r>
-      <w:bookmarkEnd w:id="82"/>
+      <w:bookmarkEnd w:id="93"/>
     </w:p>
     <w:p>
       <w:pPr>
@@ -3050,7 +3568,7 @@
       <w:pPr>
         <w:pStyle w:val="Heading3"/>
       </w:pPr>
-      <w:bookmarkStart w:id="83" w:name="schema-faq-json-ld-à-coller-dans-le-head"/>
+      <w:bookmarkStart w:id="94" w:name="schema-faq-json-ld-à-coller-dans-le-head"/>
       <w:r>
         <w:t xml:space="preserve">Schema FAQ JSON-LD (à coller dans le</w:t>
       </w:r>
@@ -3066,7 +3584,7 @@
       <w:r>
         <w:t xml:space="preserve">)</w:t>
       </w:r>
-      <w:bookmarkEnd w:id="83"/>
+      <w:bookmarkEnd w:id="94"/>
     </w:p>
     <w:p>
       <w:pPr>
@@ -4410,11 +4928,11 @@
       <w:pPr>
         <w:pStyle w:val="Heading2"/>
       </w:pPr>
-      <w:bookmarkStart w:id="84" w:name="visuels-à-créer-pour-larticle"/>
+      <w:bookmarkStart w:id="95" w:name="visuels-à-créer-pour-larticle"/>
       <w:r>
         <w:t xml:space="preserve">Visuels à créer pour l’article</w:t>
       </w:r>
-      <w:bookmarkEnd w:id="84"/>
+      <w:bookmarkEnd w:id="95"/>
     </w:p>
     <w:tbl>
       <w:tblPr>
@@ -4774,21 +5292,21 @@
       <w:pPr>
         <w:pStyle w:val="Heading2"/>
       </w:pPr>
-      <w:bookmarkStart w:id="85" w:name="notes-de-rédaction"/>
+      <w:bookmarkStart w:id="96" w:name="notes-de-rédaction"/>
       <w:r>
         <w:t xml:space="preserve">Notes de rédaction</w:t>
       </w:r>
-      <w:bookmarkEnd w:id="85"/>
+      <w:bookmarkEnd w:id="96"/>
     </w:p>
     <w:p>
       <w:pPr>
         <w:pStyle w:val="Heading3"/>
       </w:pPr>
-      <w:bookmarkStart w:id="86" w:name="ton-à-respecter"/>
+      <w:bookmarkStart w:id="97" w:name="ton-à-respecter"/>
       <w:r>
         <w:t xml:space="preserve">Ton à respecter</w:t>
       </w:r>
-      <w:bookmarkEnd w:id="86"/>
+      <w:bookmarkEnd w:id="97"/>
     </w:p>
     <w:p>
       <w:pPr>
@@ -5124,11 +5642,11 @@
       <w:pPr>
         <w:pStyle w:val="Heading3"/>
       </w:pPr>
-      <w:bookmarkStart w:id="87" w:name="longueur-cible"/>
+      <w:bookmarkStart w:id="98" w:name="longueur-cible"/>
       <w:r>
         <w:t xml:space="preserve">Longueur cible</w:t>
       </w:r>
-      <w:bookmarkEnd w:id="87"/>
+      <w:bookmarkEnd w:id="98"/>
     </w:p>
     <w:p>
       <w:pPr>
@@ -5160,11 +5678,11 @@
       <w:pPr>
         <w:pStyle w:val="Heading3"/>
       </w:pPr>
-      <w:bookmarkStart w:id="88" w:name="liens-internes-à-insérer"/>
+      <w:bookmarkStart w:id="99" w:name="liens-internes-à-insérer"/>
       <w:r>
         <w:t xml:space="preserve">Liens internes à insérer</w:t>
       </w:r>
-      <w:bookmarkEnd w:id="88"/>
+      <w:bookmarkEnd w:id="99"/>
     </w:p>
     <w:p>
       <w:pPr>
@@ -5233,11 +5751,11 @@
       <w:pPr>
         <w:pStyle w:val="Heading3"/>
       </w:pPr>
-      <w:bookmarkStart w:id="89" w:name="sources-externes-à-citer-avec-hyperliens"/>
+      <w:bookmarkStart w:id="100" w:name="sources-externes-à-citer-avec-hyperliens"/>
       <w:r>
         <w:t xml:space="preserve">Sources externes à citer (avec hyperliens)</w:t>
       </w:r>
-      <w:bookmarkEnd w:id="89"/>
+      <w:bookmarkEnd w:id="100"/>
     </w:p>
     <w:p>
       <w:pPr>
@@ -5287,6 +5805,1297 @@
         <w:t xml:space="preserve">Une étude TED ou EdPuzzle si dispo (engagement vidéo interactive)</w:t>
       </w:r>
     </w:p>
+    <w:p>
+      <w:r>
+        <w:pict>
+          <v:rect style="width:0;height:1.5pt" o:hralign="center" o:hrstd="t" o:hr="t"/>
+        </w:pict>
+      </w:r>
+    </w:p>
+    <w:p>
+      <w:pPr>
+        <w:pStyle w:val="Heading2"/>
+      </w:pPr>
+      <w:bookmarkStart w:id="101" w:name="Xdb949e91326e59bf208186c797a94349c6012d0"/>
+      <w:r>
+        <w:t xml:space="preserve">Pack sources &amp; citations (à conserver pour les retouches futures)</w:t>
+      </w:r>
+      <w:bookmarkEnd w:id="101"/>
+    </w:p>
+    <w:p>
+      <w:pPr>
+        <w:pStyle w:val="Heading3"/>
+      </w:pPr>
+      <w:bookmarkStart w:id="102" w:name="pour-la-section-2-et-lintro"/>
+      <w:r>
+        <w:t xml:space="preserve">Pour la section 2 et l’intro</w:t>
+      </w:r>
+      <w:bookmarkEnd w:id="102"/>
+    </w:p>
+    <w:tbl>
+      <w:tblPr>
+        <w:tblStyle w:val="Table"/>
+        <w:tblW w:type="pct" w:w="5000.0"/>
+        <w:tblLook w:firstRow="1"/>
+      </w:tblPr>
+      <w:tblGrid>
+        <w:gridCol w:w="2501"/>
+        <w:gridCol w:w="3334"/>
+        <w:gridCol w:w="2084"/>
+      </w:tblGrid>
+      <w:tr>
+        <w:trPr>
+          <w:cnfStyle w:firstRow="1"/>
+        </w:trPr>
+        <w:tc>
+          <w:tcPr>
+            <w:tcBorders>
+              <w:bottom w:val="single"/>
+            </w:tcBorders>
+            <w:vAlign w:val="bottom"/>
+          </w:tcPr>
+          <w:p>
+            <w:pPr>
+              <w:pStyle w:val="Compact"/>
+              <w:jc w:val="left"/>
+            </w:pPr>
+            <w:r>
+              <w:t xml:space="preserve">Stat</w:t>
+            </w:r>
+          </w:p>
+        </w:tc>
+        <w:tc>
+          <w:tcPr>
+            <w:tcBorders>
+              <w:bottom w:val="single"/>
+            </w:tcBorders>
+            <w:vAlign w:val="bottom"/>
+          </w:tcPr>
+          <w:p>
+            <w:pPr>
+              <w:pStyle w:val="Compact"/>
+              <w:jc w:val="left"/>
+            </w:pPr>
+            <w:r>
+              <w:t xml:space="preserve">Source</w:t>
+            </w:r>
+          </w:p>
+        </w:tc>
+        <w:tc>
+          <w:tcPr>
+            <w:tcBorders>
+              <w:bottom w:val="single"/>
+            </w:tcBorders>
+            <w:vAlign w:val="bottom"/>
+          </w:tcPr>
+          <w:p>
+            <w:pPr>
+              <w:pStyle w:val="Compact"/>
+              <w:jc w:val="left"/>
+            </w:pPr>
+            <w:r>
+              <w:t xml:space="preserve">URL</w:t>
+            </w:r>
+          </w:p>
+        </w:tc>
+      </w:tr>
+      <w:tr>
+        <w:tc>
+          <w:p>
+            <w:pPr>
+              <w:pStyle w:val="Compact"/>
+              <w:jc w:val="left"/>
+            </w:pPr>
+            <w:r>
+              <w:t xml:space="preserve">87 % des marketeurs disent que la vidéo a augmenté leurs ventes</w:t>
+            </w:r>
+          </w:p>
+        </w:tc>
+        <w:tc>
+          <w:p>
+            <w:pPr>
+              <w:pStyle w:val="Compact"/>
+              <w:jc w:val="left"/>
+            </w:pPr>
+            <w:r>
+              <w:t xml:space="preserve">Wyzowl State of Video Marketing 2024</w:t>
+            </w:r>
+          </w:p>
+        </w:tc>
+        <w:tc>
+          <w:p>
+            <w:pPr>
+              <w:pStyle w:val="Compact"/>
+              <w:jc w:val="left"/>
+            </w:pPr>
+            <w:r>
+              <w:t xml:space="preserve">https://www.wyzowl.com/video-marketing-statistics/</w:t>
+            </w:r>
+          </w:p>
+        </w:tc>
+      </w:tr>
+      <w:tr>
+        <w:tc>
+          <w:p>
+            <w:pPr>
+              <w:pStyle w:val="Compact"/>
+              <w:jc w:val="left"/>
+            </w:pPr>
+            <w:r>
+              <w:t xml:space="preserve">90 % disent que la vidéo a aidé à générer des leads</w:t>
+            </w:r>
+          </w:p>
+        </w:tc>
+        <w:tc>
+          <w:p>
+            <w:pPr>
+              <w:pStyle w:val="Compact"/>
+              <w:jc w:val="left"/>
+            </w:pPr>
+            <w:r>
+              <w:t xml:space="preserve">Wyzowl State of Video Marketing 2024</w:t>
+            </w:r>
+          </w:p>
+        </w:tc>
+        <w:tc>
+          <w:p>
+            <w:pPr>
+              <w:pStyle w:val="Compact"/>
+              <w:jc w:val="left"/>
+            </w:pPr>
+            <w:r>
+              <w:t xml:space="preserve">https://www.wyzowl.com/video-marketing-statistics/</w:t>
+            </w:r>
+          </w:p>
+        </w:tc>
+      </w:tr>
+      <w:tr>
+        <w:tc>
+          <w:p>
+            <w:pPr>
+              <w:pStyle w:val="Compact"/>
+              <w:jc w:val="left"/>
+            </w:pPr>
+            <w:r>
+              <w:t xml:space="preserve">96 % disent que la vidéo a aidé les prospects à comprendre l’offre</w:t>
+            </w:r>
+          </w:p>
+        </w:tc>
+        <w:tc>
+          <w:p>
+            <w:pPr>
+              <w:pStyle w:val="Compact"/>
+              <w:jc w:val="left"/>
+            </w:pPr>
+            <w:r>
+              <w:t xml:space="preserve">Wyzowl State of Video Marketing 2024</w:t>
+            </w:r>
+          </w:p>
+        </w:tc>
+        <w:tc>
+          <w:p>
+            <w:pPr>
+              <w:pStyle w:val="Compact"/>
+              <w:jc w:val="left"/>
+            </w:pPr>
+            <w:r>
+              <w:t xml:space="preserve">https://www.wyzowl.com/video-marketing-statistics/</w:t>
+            </w:r>
+          </w:p>
+        </w:tc>
+      </w:tr>
+      <w:tr>
+        <w:tc>
+          <w:p>
+            <w:pPr>
+              <w:pStyle w:val="Compact"/>
+              <w:jc w:val="left"/>
+            </w:pPr>
+            <w:r>
+              <w:t xml:space="preserve">89 % des consommateurs veulent voir plus de vidéos en 2024</w:t>
+            </w:r>
+          </w:p>
+        </w:tc>
+        <w:tc>
+          <w:p>
+            <w:pPr>
+              <w:pStyle w:val="Compact"/>
+              <w:jc w:val="left"/>
+            </w:pPr>
+            <w:r>
+              <w:t xml:space="preserve">Wyzowl State of Video Marketing 2024</w:t>
+            </w:r>
+          </w:p>
+        </w:tc>
+        <w:tc>
+          <w:p>
+            <w:pPr>
+              <w:pStyle w:val="Compact"/>
+              <w:jc w:val="left"/>
+            </w:pPr>
+            <w:r>
+              <w:t xml:space="preserve">https://www.wyzowl.com/video-marketing-statistics/</w:t>
+            </w:r>
+          </w:p>
+        </w:tc>
+      </w:tr>
+      <w:tr>
+        <w:tc>
+          <w:p>
+            <w:pPr>
+              <w:pStyle w:val="Compact"/>
+              <w:jc w:val="left"/>
+            </w:pPr>
+            <w:r>
+              <w:t xml:space="preserve">Revenus +49 % chez les utilisateurs de vidéo vs non-utilisateurs</w:t>
+            </w:r>
+          </w:p>
+        </w:tc>
+        <w:tc>
+          <w:p>
+            <w:pPr>
+              <w:pStyle w:val="Compact"/>
+              <w:jc w:val="left"/>
+            </w:pPr>
+            <w:r>
+              <w:t xml:space="preserve">Aberdeen Group, cité Vidyard</w:t>
+            </w:r>
+          </w:p>
+        </w:tc>
+        <w:tc>
+          <w:p>
+            <w:pPr>
+              <w:pStyle w:val="Compact"/>
+              <w:jc w:val="left"/>
+            </w:pPr>
+            <w:r>
+              <w:t xml:space="preserve">https://www.vidyard.com/blog/video-marketing-statistics/</w:t>
+            </w:r>
+          </w:p>
+        </w:tc>
+      </w:tr>
+      <w:tr>
+        <w:tc>
+          <w:p>
+            <w:pPr>
+              <w:pStyle w:val="Compact"/>
+              <w:jc w:val="left"/>
+            </w:pPr>
+            <w:r>
+              <w:t xml:space="preserve">1 minute de vidéo = 1,8 million de mots</w:t>
+            </w:r>
+          </w:p>
+        </w:tc>
+        <w:tc>
+          <w:p>
+            <w:pPr>
+              <w:pStyle w:val="Compact"/>
+              <w:jc w:val="left"/>
+            </w:pPr>
+            <w:r>
+              <w:t xml:space="preserve">Forrester Research (Dr James McQuivey)</w:t>
+            </w:r>
+          </w:p>
+        </w:tc>
+        <w:tc>
+          <w:p>
+            <w:pPr>
+              <w:pStyle w:val="Compact"/>
+              <w:jc w:val="left"/>
+            </w:pPr>
+            <w:r>
+              <w:t xml:space="preserve">Étude Forrester citée par</w:t>
+            </w:r>
+            <w:r>
+              <w:t xml:space="preserve"> </w:t>
+            </w:r>
+            <w:hyperlink r:id="rId103">
+              <w:r>
+                <w:rPr>
+                  <w:rStyle w:val="Hyperlink"/>
+                </w:rPr>
+                <w:t xml:space="preserve">Insivia</w:t>
+              </w:r>
+            </w:hyperlink>
+            <w:r>
+              <w:t xml:space="preserve"> </w:t>
+            </w:r>
+            <w:r>
+              <w:t xml:space="preserve">et</w:t>
+            </w:r>
+            <w:r>
+              <w:t xml:space="preserve"> </w:t>
+            </w:r>
+            <w:hyperlink r:id="rId44">
+              <w:r>
+                <w:rPr>
+                  <w:rStyle w:val="Hyperlink"/>
+                </w:rPr>
+                <w:t xml:space="preserve">HubSpot</w:t>
+              </w:r>
+            </w:hyperlink>
+          </w:p>
+        </w:tc>
+      </w:tr>
+      <w:tr>
+        <w:tc>
+          <w:p>
+            <w:pPr>
+              <w:pStyle w:val="Compact"/>
+              <w:jc w:val="left"/>
+            </w:pPr>
+            <w:r>
+              <w:t xml:space="preserve">55 % des visiteurs passent moins de 15 secondes sur une page</w:t>
+            </w:r>
+          </w:p>
+        </w:tc>
+        <w:tc>
+          <w:p>
+            <w:pPr>
+              <w:pStyle w:val="Compact"/>
+              <w:jc w:val="left"/>
+            </w:pPr>
+            <w:r>
+              <w:t xml:space="preserve">Chartbeat</w:t>
+            </w:r>
+          </w:p>
+        </w:tc>
+        <w:tc>
+          <w:p>
+            <w:pPr>
+              <w:pStyle w:val="Compact"/>
+              <w:jc w:val="left"/>
+            </w:pPr>
+            <w:r>
+              <w:t xml:space="preserve">https://chartbeat.com/blog/how-much-do-people-actually-read-online/</w:t>
+            </w:r>
+          </w:p>
+        </w:tc>
+      </w:tr>
+      <w:tr>
+        <w:tc>
+          <w:p>
+            <w:pPr>
+              <w:pStyle w:val="Compact"/>
+              <w:jc w:val="left"/>
+            </w:pPr>
+            <w:r>
+              <w:t xml:space="preserve">Visiteurs passent 2,6 fois plus de temps sur une page avec vidéo</w:t>
+            </w:r>
+          </w:p>
+        </w:tc>
+        <w:tc>
+          <w:p>
+            <w:pPr>
+              <w:pStyle w:val="Compact"/>
+              <w:jc w:val="left"/>
+            </w:pPr>
+            <w:r>
+              <w:t xml:space="preserve">Wistia State of Video Report 2024</w:t>
+            </w:r>
+          </w:p>
+        </w:tc>
+        <w:tc>
+          <w:p>
+            <w:pPr>
+              <w:pStyle w:val="Compact"/>
+              <w:jc w:val="left"/>
+            </w:pPr>
+            <w:r>
+              <w:t xml:space="preserve">https://wistia.com/learn/marketing/state-of-video-report-2024</w:t>
+            </w:r>
+          </w:p>
+        </w:tc>
+      </w:tr>
+      <w:tr>
+        <w:tc>
+          <w:p>
+            <w:pPr>
+              <w:pStyle w:val="Compact"/>
+              <w:jc w:val="left"/>
+            </w:pPr>
+            <w:r>
+              <w:t xml:space="preserve">Pages avec vidéo : conversion +80 % en moyenne</w:t>
+            </w:r>
+          </w:p>
+        </w:tc>
+        <w:tc>
+          <w:p>
+            <w:pPr>
+              <w:pStyle w:val="Compact"/>
+              <w:jc w:val="left"/>
+            </w:pPr>
+            <w:r>
+              <w:t xml:space="preserve">Eyeview Digital, cité par HubSpot</w:t>
+            </w:r>
+          </w:p>
+        </w:tc>
+        <w:tc>
+          <w:p>
+            <w:pPr>
+              <w:pStyle w:val="Compact"/>
+              <w:jc w:val="left"/>
+            </w:pPr>
+            <w:r>
+              <w:t xml:space="preserve">https://blog.hubspot.com/marketing/video-marketing-statistics</w:t>
+            </w:r>
+          </w:p>
+        </w:tc>
+      </w:tr>
+      <w:tr>
+        <w:tc>
+          <w:p>
+            <w:pPr>
+              <w:pStyle w:val="Compact"/>
+              <w:jc w:val="left"/>
+            </w:pPr>
+            <w:r>
+              <w:t xml:space="preserve">Contenu interactif : 2× plus de conversions vs passif</w:t>
+            </w:r>
+          </w:p>
+        </w:tc>
+        <w:tc>
+          <w:p>
+            <w:pPr>
+              <w:pStyle w:val="Compact"/>
+              <w:jc w:val="left"/>
+            </w:pPr>
+            <w:r>
+              <w:t xml:space="preserve">Outgrow / Demand Metric</w:t>
+            </w:r>
+          </w:p>
+        </w:tc>
+        <w:tc>
+          <w:p>
+            <w:pPr>
+              <w:pStyle w:val="Compact"/>
+              <w:jc w:val="left"/>
+            </w:pPr>
+            <w:r>
+              <w:t xml:space="preserve">https://outgrow.co/blog/interactive-content-statistics</w:t>
+            </w:r>
+          </w:p>
+        </w:tc>
+      </w:tr>
+      <w:tr>
+        <w:tc>
+          <w:p>
+            <w:pPr>
+              <w:pStyle w:val="Compact"/>
+              <w:jc w:val="left"/>
+            </w:pPr>
+            <w:r>
+              <w:t xml:space="preserve">70 % des marketeurs disent que l’interactif convertit</w:t>
+            </w:r>
+          </w:p>
+        </w:tc>
+        <w:tc>
+          <w:p>
+            <w:pPr>
+              <w:pStyle w:val="Compact"/>
+              <w:jc w:val="left"/>
+            </w:pPr>
+            <w:r>
+              <w:t xml:space="preserve">Outgrow Interactive Content Statistics</w:t>
+            </w:r>
+          </w:p>
+        </w:tc>
+        <w:tc>
+          <w:p>
+            <w:pPr>
+              <w:pStyle w:val="Compact"/>
+              <w:jc w:val="left"/>
+            </w:pPr>
+            <w:r>
+              <w:t xml:space="preserve">https://outgrow.co/blog/interactive-content-statistics</w:t>
+            </w:r>
+          </w:p>
+        </w:tc>
+      </w:tr>
+      <w:tr>
+        <w:tc>
+          <w:p>
+            <w:pPr>
+              <w:pStyle w:val="Compact"/>
+              <w:jc w:val="left"/>
+            </w:pPr>
+            <w:r>
+              <w:t xml:space="preserve">88 % disent que l’interactif les différencie des concurrents</w:t>
+            </w:r>
+          </w:p>
+        </w:tc>
+        <w:tc>
+          <w:p>
+            <w:pPr>
+              <w:pStyle w:val="Compact"/>
+              <w:jc w:val="left"/>
+            </w:pPr>
+            <w:r>
+              <w:t xml:space="preserve">Content Marketing Institute</w:t>
+            </w:r>
+          </w:p>
+        </w:tc>
+        <w:tc>
+          <w:p>
+            <w:pPr>
+              <w:pStyle w:val="Compact"/>
+              <w:jc w:val="left"/>
+            </w:pPr>
+            <w:r>
+              <w:t xml:space="preserve">https://contentmarketinginstitute.com/</w:t>
+            </w:r>
+          </w:p>
+        </w:tc>
+      </w:tr>
+      <w:tr>
+        <w:tc>
+          <w:p>
+            <w:pPr>
+              <w:pStyle w:val="Compact"/>
+              <w:jc w:val="left"/>
+            </w:pPr>
+            <w:r>
+              <w:t xml:space="preserve">Quiz lead-magnet : 33,6 % de capture en moyenne</w:t>
+            </w:r>
+          </w:p>
+        </w:tc>
+        <w:tc>
+          <w:p>
+            <w:pPr>
+              <w:pStyle w:val="Compact"/>
+              <w:jc w:val="left"/>
+            </w:pPr>
+            <w:r>
+              <w:t xml:space="preserve">Interact Quiz Marketing Statistics</w:t>
+            </w:r>
+          </w:p>
+        </w:tc>
+        <w:tc>
+          <w:p>
+            <w:pPr>
+              <w:pStyle w:val="Compact"/>
+              <w:jc w:val="left"/>
+            </w:pPr>
+            <w:r>
+              <w:t xml:space="preserve">https://www.tryinteract.com/blog/quiz-marketing-statistics/</w:t>
+            </w:r>
+          </w:p>
+        </w:tc>
+      </w:tr>
+      <w:tr>
+        <w:tc>
+          <w:p>
+            <w:pPr>
+              <w:pStyle w:val="Compact"/>
+              <w:jc w:val="left"/>
+            </w:pPr>
+            <w:r>
+              <w:t xml:space="preserve">Opt-in classique avec ebook : 2-3 % de capture</w:t>
+            </w:r>
+          </w:p>
+        </w:tc>
+        <w:tc>
+          <w:p>
+            <w:pPr>
+              <w:pStyle w:val="Compact"/>
+              <w:jc w:val="left"/>
+            </w:pPr>
+            <w:r>
+              <w:t xml:space="preserve">Sumo / GetResponse benchmarks</w:t>
+            </w:r>
+          </w:p>
+        </w:tc>
+        <w:tc>
+          <w:p>
+            <w:pPr>
+              <w:pStyle w:val="Compact"/>
+              <w:jc w:val="left"/>
+            </w:pPr>
+            <w:r>
+              <w:t xml:space="preserve">https://www.getresponse.com/resources/reports/email-marketing-benchmarks</w:t>
+            </w:r>
+          </w:p>
+        </w:tc>
+      </w:tr>
+      <w:tr>
+        <w:tc>
+          <w:p>
+            <w:pPr>
+              <w:pStyle w:val="Compact"/>
+              <w:jc w:val="left"/>
+            </w:pPr>
+            <w:r>
+              <w:t xml:space="preserve">Vidéo interactive : ×5 d’engagement vs vidéo linéaire</w:t>
+            </w:r>
+          </w:p>
+        </w:tc>
+        <w:tc>
+          <w:p>
+            <w:pPr>
+              <w:pStyle w:val="Compact"/>
+              <w:jc w:val="left"/>
+            </w:pPr>
+            <w:r>
+              <w:t xml:space="preserve">Demand Gen Report</w:t>
+            </w:r>
+          </w:p>
+        </w:tc>
+        <w:tc>
+          <w:p>
+            <w:pPr>
+              <w:pStyle w:val="Compact"/>
+              <w:jc w:val="left"/>
+            </w:pPr>
+            <w:r>
+              <w:t xml:space="preserve">https://www.demandgenreport.com/</w:t>
+            </w:r>
+          </w:p>
+        </w:tc>
+      </w:tr>
+      <w:tr>
+        <w:tc>
+          <w:p>
+            <w:pPr>
+              <w:pStyle w:val="Compact"/>
+              <w:jc w:val="left"/>
+            </w:pPr>
+            <w:r>
+              <w:t xml:space="preserve">Vidéos interactives : taux de complétion +50 %</w:t>
+            </w:r>
+          </w:p>
+        </w:tc>
+        <w:tc>
+          <w:p>
+            <w:pPr>
+              <w:pStyle w:val="Compact"/>
+              <w:jc w:val="left"/>
+            </w:pPr>
+            <w:r>
+              <w:t xml:space="preserve">Wibbitz Video Marketing Statistics</w:t>
+            </w:r>
+          </w:p>
+        </w:tc>
+        <w:tc>
+          <w:p>
+            <w:pPr>
+              <w:pStyle w:val="Compact"/>
+              <w:jc w:val="left"/>
+            </w:pPr>
+            <w:r>
+              <w:t xml:space="preserve">https://www.wibbitz.com/</w:t>
+            </w:r>
+          </w:p>
+        </w:tc>
+      </w:tr>
+    </w:tbl>
+    <w:p>
+      <w:pPr>
+        <w:pStyle w:val="Heading3"/>
+      </w:pPr>
+      <w:bookmarkStart w:id="104" w:name="X88e10f5350127b9696787dcd33bc301bbbe0207"/>
+      <w:r>
+        <w:t xml:space="preserve">Pour les sections cas d’usage et pricing (section 4 et 6)</w:t>
+      </w:r>
+      <w:bookmarkEnd w:id="104"/>
+    </w:p>
+    <w:tbl>
+      <w:tblPr>
+        <w:tblStyle w:val="Table"/>
+        <w:tblW w:type="pct" w:w="5000.0"/>
+        <w:tblLook w:firstRow="1"/>
+      </w:tblPr>
+      <w:tblGrid>
+        <w:gridCol w:w="2501"/>
+        <w:gridCol w:w="3334"/>
+        <w:gridCol w:w="2084"/>
+      </w:tblGrid>
+      <w:tr>
+        <w:trPr>
+          <w:cnfStyle w:firstRow="1"/>
+        </w:trPr>
+        <w:tc>
+          <w:tcPr>
+            <w:tcBorders>
+              <w:bottom w:val="single"/>
+            </w:tcBorders>
+            <w:vAlign w:val="bottom"/>
+          </w:tcPr>
+          <w:p>
+            <w:pPr>
+              <w:pStyle w:val="Compact"/>
+              <w:jc w:val="left"/>
+            </w:pPr>
+            <w:r>
+              <w:t xml:space="preserve">Stat</w:t>
+            </w:r>
+          </w:p>
+        </w:tc>
+        <w:tc>
+          <w:tcPr>
+            <w:tcBorders>
+              <w:bottom w:val="single"/>
+            </w:tcBorders>
+            <w:vAlign w:val="bottom"/>
+          </w:tcPr>
+          <w:p>
+            <w:pPr>
+              <w:pStyle w:val="Compact"/>
+              <w:jc w:val="left"/>
+            </w:pPr>
+            <w:r>
+              <w:t xml:space="preserve">Source</w:t>
+            </w:r>
+          </w:p>
+        </w:tc>
+        <w:tc>
+          <w:tcPr>
+            <w:tcBorders>
+              <w:bottom w:val="single"/>
+            </w:tcBorders>
+            <w:vAlign w:val="bottom"/>
+          </w:tcPr>
+          <w:p>
+            <w:pPr>
+              <w:pStyle w:val="Compact"/>
+              <w:jc w:val="left"/>
+            </w:pPr>
+            <w:r>
+              <w:t xml:space="preserve">URL</w:t>
+            </w:r>
+          </w:p>
+        </w:tc>
+      </w:tr>
+      <w:tr>
+        <w:tc>
+          <w:p>
+            <w:pPr>
+              <w:pStyle w:val="Compact"/>
+              <w:jc w:val="left"/>
+            </w:pPr>
+            <w:r>
+              <w:t xml:space="preserve">Email ROI : 36 € pour 1 € investi</w:t>
+            </w:r>
+          </w:p>
+        </w:tc>
+        <w:tc>
+          <w:p>
+            <w:pPr>
+              <w:pStyle w:val="Compact"/>
+              <w:jc w:val="left"/>
+            </w:pPr>
+            <w:r>
+              <w:t xml:space="preserve">Litmus State of Email 2024</w:t>
+            </w:r>
+          </w:p>
+        </w:tc>
+        <w:tc>
+          <w:p>
+            <w:pPr>
+              <w:pStyle w:val="Compact"/>
+              <w:jc w:val="left"/>
+            </w:pPr>
+            <w:r>
+              <w:t xml:space="preserve">https://www.litmus.com/resources/state-of-email-2024/</w:t>
+            </w:r>
+          </w:p>
+        </w:tc>
+      </w:tr>
+      <w:tr>
+        <w:tc>
+          <w:p>
+            <w:pPr>
+              <w:pStyle w:val="Compact"/>
+              <w:jc w:val="left"/>
+            </w:pPr>
+            <w:r>
+              <w:t xml:space="preserve">Listes segmentées : taux d’ouverture supérieur, taux de désabo inférieur</w:t>
+            </w:r>
+          </w:p>
+        </w:tc>
+        <w:tc>
+          <w:p>
+            <w:pPr>
+              <w:pStyle w:val="Compact"/>
+              <w:jc w:val="left"/>
+            </w:pPr>
+            <w:r>
+              <w:t xml:space="preserve">Mailchimp Email Marketing Benchmarks</w:t>
+            </w:r>
+          </w:p>
+        </w:tc>
+        <w:tc>
+          <w:p>
+            <w:pPr>
+              <w:pStyle w:val="Compact"/>
+              <w:jc w:val="left"/>
+            </w:pPr>
+            <w:r>
+              <w:t xml:space="preserve">https://mailchimp.com/resources/email-marketing-benchmarks/</w:t>
+            </w:r>
+          </w:p>
+        </w:tc>
+      </w:tr>
+      <w:tr>
+        <w:tc>
+          <w:p>
+            <w:pPr>
+              <w:pStyle w:val="Compact"/>
+              <w:jc w:val="left"/>
+            </w:pPr>
+            <w:r>
+              <w:t xml:space="preserve">Audiences custom Meta : CPA significativement réduit vs audience froide</w:t>
+            </w:r>
+          </w:p>
+        </w:tc>
+        <w:tc>
+          <w:p>
+            <w:pPr>
+              <w:pStyle w:val="Compact"/>
+              <w:jc w:val="left"/>
+            </w:pPr>
+            <w:r>
+              <w:t xml:space="preserve">Meta Business — Lookalike Audiences</w:t>
+            </w:r>
+          </w:p>
+        </w:tc>
+        <w:tc>
+          <w:p>
+            <w:pPr>
+              <w:pStyle w:val="Compact"/>
+              <w:jc w:val="left"/>
+            </w:pPr>
+            <w:r>
+              <w:t xml:space="preserve">https://www.facebook.com/business/ads/lookalike-audiences</w:t>
+            </w:r>
+          </w:p>
+        </w:tc>
+      </w:tr>
+    </w:tbl>
+    <w:p>
+      <w:pPr>
+        <w:pStyle w:val="Heading3"/>
+      </w:pPr>
+      <w:bookmarkStart w:id="105" w:name="pour-la-légalité-section-3-et-faq"/>
+      <w:r>
+        <w:t xml:space="preserve">Pour la légalité (section 3 et FAQ)</w:t>
+      </w:r>
+      <w:bookmarkEnd w:id="105"/>
+    </w:p>
+    <w:tbl>
+      <w:tblPr>
+        <w:tblStyle w:val="Table"/>
+        <w:tblW w:type="pct" w:w="5000.0"/>
+        <w:tblLook w:firstRow="1"/>
+      </w:tblPr>
+      <w:tblGrid>
+        <w:gridCol w:w="3168"/>
+        <w:gridCol w:w="1980"/>
+        <w:gridCol w:w="2772"/>
+      </w:tblGrid>
+      <w:tr>
+        <w:trPr>
+          <w:cnfStyle w:firstRow="1"/>
+        </w:trPr>
+        <w:tc>
+          <w:tcPr>
+            <w:tcBorders>
+              <w:bottom w:val="single"/>
+            </w:tcBorders>
+            <w:vAlign w:val="bottom"/>
+          </w:tcPr>
+          <w:p>
+            <w:pPr>
+              <w:pStyle w:val="Compact"/>
+              <w:jc w:val="left"/>
+            </w:pPr>
+            <w:r>
+              <w:t xml:space="preserve">Source</w:t>
+            </w:r>
+          </w:p>
+        </w:tc>
+        <w:tc>
+          <w:tcPr>
+            <w:tcBorders>
+              <w:bottom w:val="single"/>
+            </w:tcBorders>
+            <w:vAlign w:val="bottom"/>
+          </w:tcPr>
+          <w:p>
+            <w:pPr>
+              <w:pStyle w:val="Compact"/>
+              <w:jc w:val="left"/>
+            </w:pPr>
+            <w:r>
+              <w:t xml:space="preserve">URL</w:t>
+            </w:r>
+          </w:p>
+        </w:tc>
+        <w:tc>
+          <w:tcPr>
+            <w:tcBorders>
+              <w:bottom w:val="single"/>
+            </w:tcBorders>
+            <w:vAlign w:val="bottom"/>
+          </w:tcPr>
+          <w:p>
+            <w:pPr>
+              <w:pStyle w:val="Compact"/>
+              <w:jc w:val="left"/>
+            </w:pPr>
+            <w:r>
+              <w:t xml:space="preserve">Usage</w:t>
+            </w:r>
+          </w:p>
+        </w:tc>
+      </w:tr>
+      <w:tr>
+        <w:tc>
+          <w:p>
+            <w:pPr>
+              <w:pStyle w:val="Compact"/>
+              <w:jc w:val="left"/>
+            </w:pPr>
+            <w:r>
+              <w:t xml:space="preserve">YouTube Embedding Policy</w:t>
+            </w:r>
+          </w:p>
+        </w:tc>
+        <w:tc>
+          <w:p>
+            <w:pPr>
+              <w:pStyle w:val="Compact"/>
+              <w:jc w:val="left"/>
+            </w:pPr>
+            <w:r>
+              <w:t xml:space="preserve">https://support.google.com/youtube/answer/171780</w:t>
+            </w:r>
+          </w:p>
+        </w:tc>
+        <w:tc>
+          <w:p>
+            <w:pPr>
+              <w:pStyle w:val="Compact"/>
+              <w:jc w:val="left"/>
+            </w:pPr>
+            <w:r>
+              <w:t xml:space="preserve">Confirme que l’embed standard est permis</w:t>
+            </w:r>
+          </w:p>
+        </w:tc>
+      </w:tr>
+      <w:tr>
+        <w:tc>
+          <w:p>
+            <w:pPr>
+              <w:pStyle w:val="Compact"/>
+              <w:jc w:val="left"/>
+            </w:pPr>
+            <w:r>
+              <w:t xml:space="preserve">Vimeo Embed Policy</w:t>
+            </w:r>
+          </w:p>
+        </w:tc>
+        <w:tc>
+          <w:p>
+            <w:pPr>
+              <w:pStyle w:val="Compact"/>
+              <w:jc w:val="left"/>
+            </w:pPr>
+            <w:r>
+              <w:t xml:space="preserve">https://help.vimeo.com/hc/en-us/articles/12426256148369</w:t>
+            </w:r>
+          </w:p>
+        </w:tc>
+        <w:tc>
+          <w:p>
+            <w:pPr>
+              <w:pStyle w:val="Compact"/>
+              <w:jc w:val="left"/>
+            </w:pPr>
+            <w:r>
+              <w:t xml:space="preserve">Confirme que l’embed standard est permis</w:t>
+            </w:r>
+          </w:p>
+        </w:tc>
+      </w:tr>
+    </w:tbl>
+    <w:p>
+      <w:pPr>
+        <w:pStyle w:val="Heading3"/>
+      </w:pPr>
+      <w:bookmarkStart w:id="106" w:name="X725ba996a5945c3a85d96f7a54a710916d0750f"/>
+      <w:r>
+        <w:t xml:space="preserve">Visuels chiffrés à créer (cohérents avec les sources)</w:t>
+      </w:r>
+      <w:bookmarkEnd w:id="106"/>
+    </w:p>
+    <w:tbl>
+      <w:tblPr>
+        <w:tblStyle w:val="Table"/>
+        <w:tblW w:type="pct" w:w="5000.0"/>
+        <w:tblLook w:firstRow="1"/>
+      </w:tblPr>
+      <w:tblGrid>
+        <w:gridCol w:w="1584"/>
+        <w:gridCol w:w="4752"/>
+        <w:gridCol w:w="1584"/>
+      </w:tblGrid>
+      <w:tr>
+        <w:trPr>
+          <w:cnfStyle w:firstRow="1"/>
+        </w:trPr>
+        <w:tc>
+          <w:tcPr>
+            <w:tcBorders>
+              <w:bottom w:val="single"/>
+            </w:tcBorders>
+            <w:vAlign w:val="bottom"/>
+          </w:tcPr>
+          <w:p>
+            <w:pPr>
+              <w:pStyle w:val="Compact"/>
+              <w:jc w:val="left"/>
+            </w:pPr>
+            <w:r>
+              <w:t xml:space="preserve">Visuel</w:t>
+            </w:r>
+          </w:p>
+        </w:tc>
+        <w:tc>
+          <w:tcPr>
+            <w:tcBorders>
+              <w:bottom w:val="single"/>
+            </w:tcBorders>
+            <w:vAlign w:val="bottom"/>
+          </w:tcPr>
+          <w:p>
+            <w:pPr>
+              <w:pStyle w:val="Compact"/>
+              <w:jc w:val="left"/>
+            </w:pPr>
+            <w:r>
+              <w:t xml:space="preserve">Stat à mettre en avant</w:t>
+            </w:r>
+          </w:p>
+        </w:tc>
+        <w:tc>
+          <w:tcPr>
+            <w:tcBorders>
+              <w:bottom w:val="single"/>
+            </w:tcBorders>
+            <w:vAlign w:val="bottom"/>
+          </w:tcPr>
+          <w:p>
+            <w:pPr>
+              <w:pStyle w:val="Compact"/>
+              <w:jc w:val="left"/>
+            </w:pPr>
+            <w:r>
+              <w:t xml:space="preserve">Source</w:t>
+            </w:r>
+          </w:p>
+        </w:tc>
+      </w:tr>
+      <w:tr>
+        <w:tc>
+          <w:p>
+            <w:pPr>
+              <w:pStyle w:val="Compact"/>
+              <w:jc w:val="left"/>
+            </w:pPr>
+            <w:r>
+              <w:t xml:space="preserve">87 % grand chiffre</w:t>
+            </w:r>
+          </w:p>
+        </w:tc>
+        <w:tc>
+          <w:p>
+            <w:pPr>
+              <w:pStyle w:val="Compact"/>
+              <w:jc w:val="left"/>
+            </w:pPr>
+            <w:r>
+              <w:t xml:space="preserve">“</w:t>
+            </w:r>
+            <w:r>
+              <w:t xml:space="preserve">87 % des marketeurs disent que la vidéo a augmenté leurs ventes</w:t>
+            </w:r>
+            <w:r>
+              <w:t xml:space="preserve">”</w:t>
+            </w:r>
+          </w:p>
+        </w:tc>
+        <w:tc>
+          <w:p>
+            <w:pPr>
+              <w:pStyle w:val="Compact"/>
+              <w:jc w:val="left"/>
+            </w:pPr>
+            <w:r>
+              <w:t xml:space="preserve">Wyzowl 2024</w:t>
+            </w:r>
+          </w:p>
+        </w:tc>
+      </w:tr>
+      <w:tr>
+        <w:tc>
+          <w:p>
+            <w:pPr>
+              <w:pStyle w:val="Compact"/>
+              <w:jc w:val="left"/>
+            </w:pPr>
+            <w:r>
+              <w:t xml:space="preserve">33,6 % vs 2,5 %</w:t>
+            </w:r>
+          </w:p>
+        </w:tc>
+        <w:tc>
+          <w:p>
+            <w:pPr>
+              <w:pStyle w:val="Compact"/>
+              <w:jc w:val="left"/>
+            </w:pPr>
+            <w:r>
+              <w:t xml:space="preserve">“</w:t>
+            </w:r>
+            <w:r>
+              <w:t xml:space="preserve">Quiz vs Opt-in classique : 10 à 15× plus de contacts</w:t>
+            </w:r>
+            <w:r>
+              <w:t xml:space="preserve">”</w:t>
+            </w:r>
+          </w:p>
+        </w:tc>
+        <w:tc>
+          <w:p>
+            <w:pPr>
+              <w:pStyle w:val="Compact"/>
+              <w:jc w:val="left"/>
+            </w:pPr>
+            <w:r>
+              <w:t xml:space="preserve">Interact / Sumo</w:t>
+            </w:r>
+          </w:p>
+        </w:tc>
+      </w:tr>
+      <w:tr>
+        <w:tc>
+          <w:p>
+            <w:pPr>
+              <w:pStyle w:val="Compact"/>
+              <w:jc w:val="left"/>
+            </w:pPr>
+            <w:r>
+              <w:t xml:space="preserve">2,6× plus de temps sur la page</w:t>
+            </w:r>
+          </w:p>
+        </w:tc>
+        <w:tc>
+          <w:p>
+            <w:pPr>
+              <w:pStyle w:val="Compact"/>
+              <w:jc w:val="left"/>
+            </w:pPr>
+            <w:r>
+              <w:t xml:space="preserve">“</w:t>
+            </w:r>
+            <w:r>
+              <w:t xml:space="preserve">Vidéo intégrée : 2,6× plus de temps passé</w:t>
+            </w:r>
+            <w:r>
+              <w:t xml:space="preserve">”</w:t>
+            </w:r>
+          </w:p>
+        </w:tc>
+        <w:tc>
+          <w:p>
+            <w:pPr>
+              <w:pStyle w:val="Compact"/>
+              <w:jc w:val="left"/>
+            </w:pPr>
+            <w:r>
+              <w:t xml:space="preserve">Wistia 2024</w:t>
+            </w:r>
+          </w:p>
+        </w:tc>
+      </w:tr>
+      <w:tr>
+        <w:tc>
+          <w:p>
+            <w:pPr>
+              <w:pStyle w:val="Compact"/>
+              <w:jc w:val="left"/>
+            </w:pPr>
+            <w:r>
+              <w:t xml:space="preserve">5× engagement vidéo interactive</w:t>
+            </w:r>
+          </w:p>
+        </w:tc>
+        <w:tc>
+          <w:p>
+            <w:pPr>
+              <w:pStyle w:val="Compact"/>
+              <w:jc w:val="left"/>
+            </w:pPr>
+            <w:r>
+              <w:t xml:space="preserve">“</w:t>
+            </w:r>
+            <w:r>
+              <w:t xml:space="preserve">Vidéo interactive : ×5 d’engagement vs vidéo linéaire</w:t>
+            </w:r>
+            <w:r>
+              <w:t xml:space="preserve">”</w:t>
+            </w:r>
+          </w:p>
+        </w:tc>
+        <w:tc>
+          <w:p>
+            <w:pPr>
+              <w:pStyle w:val="Compact"/>
+              <w:jc w:val="left"/>
+            </w:pPr>
+            <w:r>
+              <w:t xml:space="preserve">Demand Gen Report</w:t>
+            </w:r>
+          </w:p>
+        </w:tc>
+      </w:tr>
+      <w:tr>
+        <w:tc>
+          <w:p>
+            <w:pPr>
+              <w:pStyle w:val="Compact"/>
+              <w:jc w:val="left"/>
+            </w:pPr>
+            <w:r>
+              <w:t xml:space="preserve">Marque-page dans un livre</w:t>
+            </w:r>
+          </w:p>
+        </w:tc>
+        <w:tc>
+          <w:p>
+            <w:pPr>
+              <w:pStyle w:val="Compact"/>
+              <w:jc w:val="left"/>
+            </w:pPr>
+            <w:r>
+              <w:t xml:space="preserve">Métaphore légale</w:t>
+            </w:r>
+          </w:p>
+        </w:tc>
+        <w:tc>
+          <w:p>
+            <w:pPr>
+              <w:pStyle w:val="Compact"/>
+              <w:jc w:val="left"/>
+            </w:pPr>
+            <w:r>
+              <w:t xml:space="preserve">–</w:t>
+            </w:r>
+          </w:p>
+        </w:tc>
+      </w:tr>
+    </w:tbl>
     <w:sectPr/>
   </w:body>
 </w:document>

</xml_diff>